<commit_message>
docs: chuan hoa thuat ngu (AIoT -> IoT, nghi nga, thiet lap ket noi truoc, pha on dinh/xac minh tu the)
- README, firmware/wearable/README, bao cao .docx, slide .pptx/.html
- Tin nhan Telegram cua cau noi camera K230 doi "AIoT" thanh "IoT"
</commit_message>
<xml_diff>
--- a/docs/reports/Bao_cao_Nhom_1_VMBD_K23A_Phat_hien_te_nga.docx
+++ b/docs/reports/Bao_cao_Nhom_1_VMBD_K23A_Phat_hien_te_nga.docx
@@ -639,7 +639,7 @@
       <w:r>
         <w:fldChar w:fldCharType="separate"/>
       </w:r>
-      <w:hyperlink w:anchor="_Toc244339744" w:history="1">
+      <w:hyperlink w:anchor="_Toc244342736" w:history="1">
         <w:r>
           <w:rPr>
             <w:rStyle w:val="Hyperlink"/>
@@ -663,7 +663,7 @@
           <w:rPr>
             <w:webHidden/>
           </w:rPr>
-          <w:instrText xml:space="preserve"> PAGEREF _Toc244339744 \h </w:instrText>
+          <w:instrText xml:space="preserve"> PAGEREF _Toc244342736 \h </w:instrText>
         </w:r>
         <w:r>
           <w:rPr>
@@ -704,7 +704,7 @@
           <w14:ligatures w14:val="standardContextual"/>
         </w:rPr>
       </w:pPr>
-      <w:hyperlink w:anchor="_Toc244339745" w:history="1">
+      <w:hyperlink w:anchor="_Toc244342737" w:history="1">
         <w:r>
           <w:rPr>
             <w:rStyle w:val="Hyperlink"/>
@@ -728,7 +728,7 @@
           <w:rPr>
             <w:webHidden/>
           </w:rPr>
-          <w:instrText xml:space="preserve"> PAGEREF _Toc244339745 \h </w:instrText>
+          <w:instrText xml:space="preserve"> PAGEREF _Toc244342737 \h </w:instrText>
         </w:r>
         <w:r>
           <w:rPr>
@@ -769,7 +769,7 @@
           <w14:ligatures w14:val="standardContextual"/>
         </w:rPr>
       </w:pPr>
-      <w:hyperlink w:anchor="_Toc244339746" w:history="1">
+      <w:hyperlink w:anchor="_Toc244342738" w:history="1">
         <w:r>
           <w:rPr>
             <w:rStyle w:val="Hyperlink"/>
@@ -793,7 +793,7 @@
           <w:rPr>
             <w:webHidden/>
           </w:rPr>
-          <w:instrText xml:space="preserve"> PAGEREF _Toc244339746 \h </w:instrText>
+          <w:instrText xml:space="preserve"> PAGEREF _Toc244342738 \h </w:instrText>
         </w:r>
         <w:r>
           <w:rPr>
@@ -834,7 +834,7 @@
           <w14:ligatures w14:val="standardContextual"/>
         </w:rPr>
       </w:pPr>
-      <w:hyperlink w:anchor="_Toc244339747" w:history="1">
+      <w:hyperlink w:anchor="_Toc244342739" w:history="1">
         <w:r>
           <w:rPr>
             <w:rStyle w:val="Hyperlink"/>
@@ -858,7 +858,7 @@
           <w:rPr>
             <w:webHidden/>
           </w:rPr>
-          <w:instrText xml:space="preserve"> PAGEREF _Toc244339747 \h </w:instrText>
+          <w:instrText xml:space="preserve"> PAGEREF _Toc244342739 \h </w:instrText>
         </w:r>
         <w:r>
           <w:rPr>
@@ -899,7 +899,7 @@
           <w14:ligatures w14:val="standardContextual"/>
         </w:rPr>
       </w:pPr>
-      <w:hyperlink w:anchor="_Toc244339748" w:history="1">
+      <w:hyperlink w:anchor="_Toc244342740" w:history="1">
         <w:r>
           <w:rPr>
             <w:rStyle w:val="Hyperlink"/>
@@ -923,7 +923,7 @@
           <w:rPr>
             <w:webHidden/>
           </w:rPr>
-          <w:instrText xml:space="preserve"> PAGEREF _Toc244339748 \h </w:instrText>
+          <w:instrText xml:space="preserve"> PAGEREF _Toc244342740 \h </w:instrText>
         </w:r>
         <w:r>
           <w:rPr>
@@ -963,7 +963,7 @@
           <w14:ligatures w14:val="standardContextual"/>
         </w:rPr>
       </w:pPr>
-      <w:hyperlink w:anchor="_Toc244339749" w:history="1">
+      <w:hyperlink w:anchor="_Toc244342741" w:history="1">
         <w:r>
           <w:rPr>
             <w:rStyle w:val="Hyperlink"/>
@@ -987,7 +987,7 @@
           <w:rPr>
             <w:webHidden/>
           </w:rPr>
-          <w:instrText xml:space="preserve"> PAGEREF _Toc244339749 \h </w:instrText>
+          <w:instrText xml:space="preserve"> PAGEREF _Toc244342741 \h </w:instrText>
         </w:r>
         <w:r>
           <w:rPr>
@@ -1027,7 +1027,7 @@
           <w14:ligatures w14:val="standardContextual"/>
         </w:rPr>
       </w:pPr>
-      <w:hyperlink w:anchor="_Toc244339750" w:history="1">
+      <w:hyperlink w:anchor="_Toc244342742" w:history="1">
         <w:r>
           <w:rPr>
             <w:rStyle w:val="Hyperlink"/>
@@ -1051,7 +1051,7 @@
           <w:rPr>
             <w:webHidden/>
           </w:rPr>
-          <w:instrText xml:space="preserve"> PAGEREF _Toc244339750 \h </w:instrText>
+          <w:instrText xml:space="preserve"> PAGEREF _Toc244342742 \h </w:instrText>
         </w:r>
         <w:r>
           <w:rPr>
@@ -1094,7 +1094,7 @@
           <w14:ligatures w14:val="standardContextual"/>
         </w:rPr>
       </w:pPr>
-      <w:hyperlink w:anchor="_Toc244339751" w:history="1">
+      <w:hyperlink w:anchor="_Toc244342743" w:history="1">
         <w:r>
           <w:rPr>
             <w:rStyle w:val="Hyperlink"/>
@@ -1122,7 +1122,7 @@
             <w:noProof/>
             <w:webHidden/>
           </w:rPr>
-          <w:instrText xml:space="preserve"> PAGEREF _Toc244339751 \h </w:instrText>
+          <w:instrText xml:space="preserve"> PAGEREF _Toc244342743 \h </w:instrText>
         </w:r>
         <w:r>
           <w:rPr>
@@ -1169,7 +1169,7 @@
           <w14:ligatures w14:val="standardContextual"/>
         </w:rPr>
       </w:pPr>
-      <w:hyperlink w:anchor="_Toc244339752" w:history="1">
+      <w:hyperlink w:anchor="_Toc244342744" w:history="1">
         <w:r>
           <w:rPr>
             <w:rStyle w:val="Hyperlink"/>
@@ -1197,7 +1197,7 @@
             <w:noProof/>
             <w:webHidden/>
           </w:rPr>
-          <w:instrText xml:space="preserve"> PAGEREF _Toc244339752 \h </w:instrText>
+          <w:instrText xml:space="preserve"> PAGEREF _Toc244342744 \h </w:instrText>
         </w:r>
         <w:r>
           <w:rPr>
@@ -1241,7 +1241,7 @@
           <w14:ligatures w14:val="standardContextual"/>
         </w:rPr>
       </w:pPr>
-      <w:hyperlink w:anchor="_Toc244339753" w:history="1">
+      <w:hyperlink w:anchor="_Toc244342745" w:history="1">
         <w:r>
           <w:rPr>
             <w:rStyle w:val="Hyperlink"/>
@@ -1265,7 +1265,7 @@
           <w:rPr>
             <w:webHidden/>
           </w:rPr>
-          <w:instrText xml:space="preserve"> PAGEREF _Toc244339753 \h </w:instrText>
+          <w:instrText xml:space="preserve"> PAGEREF _Toc244342745 \h </w:instrText>
         </w:r>
         <w:r>
           <w:rPr>
@@ -1308,7 +1308,7 @@
           <w14:ligatures w14:val="standardContextual"/>
         </w:rPr>
       </w:pPr>
-      <w:hyperlink w:anchor="_Toc244339754" w:history="1">
+      <w:hyperlink w:anchor="_Toc244342746" w:history="1">
         <w:r>
           <w:rPr>
             <w:rStyle w:val="Hyperlink"/>
@@ -1336,7 +1336,7 @@
             <w:noProof/>
             <w:webHidden/>
           </w:rPr>
-          <w:instrText xml:space="preserve"> PAGEREF _Toc244339754 \h </w:instrText>
+          <w:instrText xml:space="preserve"> PAGEREF _Toc244342746 \h </w:instrText>
         </w:r>
         <w:r>
           <w:rPr>
@@ -1383,7 +1383,7 @@
           <w14:ligatures w14:val="standardContextual"/>
         </w:rPr>
       </w:pPr>
-      <w:hyperlink w:anchor="_Toc244339755" w:history="1">
+      <w:hyperlink w:anchor="_Toc244342747" w:history="1">
         <w:r>
           <w:rPr>
             <w:rStyle w:val="Hyperlink"/>
@@ -1411,7 +1411,7 @@
             <w:noProof/>
             <w:webHidden/>
           </w:rPr>
-          <w:instrText xml:space="preserve"> PAGEREF _Toc244339755 \h </w:instrText>
+          <w:instrText xml:space="preserve"> PAGEREF _Toc244342747 \h </w:instrText>
         </w:r>
         <w:r>
           <w:rPr>
@@ -1455,7 +1455,7 @@
           <w14:ligatures w14:val="standardContextual"/>
         </w:rPr>
       </w:pPr>
-      <w:hyperlink w:anchor="_Toc244339756" w:history="1">
+      <w:hyperlink w:anchor="_Toc244342748" w:history="1">
         <w:r>
           <w:rPr>
             <w:rStyle w:val="Hyperlink"/>
@@ -1479,7 +1479,7 @@
           <w:rPr>
             <w:webHidden/>
           </w:rPr>
-          <w:instrText xml:space="preserve"> PAGEREF _Toc244339756 \h </w:instrText>
+          <w:instrText xml:space="preserve"> PAGEREF _Toc244342748 \h </w:instrText>
         </w:r>
         <w:r>
           <w:rPr>
@@ -1522,7 +1522,7 @@
           <w14:ligatures w14:val="standardContextual"/>
         </w:rPr>
       </w:pPr>
-      <w:hyperlink w:anchor="_Toc244339757" w:history="1">
+      <w:hyperlink w:anchor="_Toc244342749" w:history="1">
         <w:r>
           <w:rPr>
             <w:rStyle w:val="Hyperlink"/>
@@ -1550,7 +1550,7 @@
             <w:noProof/>
             <w:webHidden/>
           </w:rPr>
-          <w:instrText xml:space="preserve"> PAGEREF _Toc244339757 \h </w:instrText>
+          <w:instrText xml:space="preserve"> PAGEREF _Toc244342749 \h </w:instrText>
         </w:r>
         <w:r>
           <w:rPr>
@@ -1597,7 +1597,7 @@
           <w14:ligatures w14:val="standardContextual"/>
         </w:rPr>
       </w:pPr>
-      <w:hyperlink w:anchor="_Toc244339758" w:history="1">
+      <w:hyperlink w:anchor="_Toc244342750" w:history="1">
         <w:r>
           <w:rPr>
             <w:rStyle w:val="Hyperlink"/>
@@ -1625,7 +1625,7 @@
             <w:noProof/>
             <w:webHidden/>
           </w:rPr>
-          <w:instrText xml:space="preserve"> PAGEREF _Toc244339758 \h </w:instrText>
+          <w:instrText xml:space="preserve"> PAGEREF _Toc244342750 \h </w:instrText>
         </w:r>
         <w:r>
           <w:rPr>
@@ -1672,7 +1672,7 @@
           <w14:ligatures w14:val="standardContextual"/>
         </w:rPr>
       </w:pPr>
-      <w:hyperlink w:anchor="_Toc244339759" w:history="1">
+      <w:hyperlink w:anchor="_Toc244342751" w:history="1">
         <w:r>
           <w:rPr>
             <w:rStyle w:val="Hyperlink"/>
@@ -1700,7 +1700,7 @@
             <w:noProof/>
             <w:webHidden/>
           </w:rPr>
-          <w:instrText xml:space="preserve"> PAGEREF _Toc244339759 \h </w:instrText>
+          <w:instrText xml:space="preserve"> PAGEREF _Toc244342751 \h </w:instrText>
         </w:r>
         <w:r>
           <w:rPr>
@@ -1745,7 +1745,7 @@
           <w14:ligatures w14:val="standardContextual"/>
         </w:rPr>
       </w:pPr>
-      <w:hyperlink w:anchor="_Toc244339760" w:history="1">
+      <w:hyperlink w:anchor="_Toc244342752" w:history="1">
         <w:r>
           <w:rPr>
             <w:rStyle w:val="Hyperlink"/>
@@ -1769,7 +1769,7 @@
           <w:rPr>
             <w:webHidden/>
           </w:rPr>
-          <w:instrText xml:space="preserve"> PAGEREF _Toc244339760 \h </w:instrText>
+          <w:instrText xml:space="preserve"> PAGEREF _Toc244342752 \h </w:instrText>
         </w:r>
         <w:r>
           <w:rPr>
@@ -1809,7 +1809,7 @@
           <w14:ligatures w14:val="standardContextual"/>
         </w:rPr>
       </w:pPr>
-      <w:hyperlink w:anchor="_Toc244339761" w:history="1">
+      <w:hyperlink w:anchor="_Toc244342753" w:history="1">
         <w:r>
           <w:rPr>
             <w:rStyle w:val="Hyperlink"/>
@@ -1833,7 +1833,7 @@
           <w:rPr>
             <w:webHidden/>
           </w:rPr>
-          <w:instrText xml:space="preserve"> PAGEREF _Toc244339761 \h </w:instrText>
+          <w:instrText xml:space="preserve"> PAGEREF _Toc244342753 \h </w:instrText>
         </w:r>
         <w:r>
           <w:rPr>
@@ -1873,7 +1873,7 @@
           <w14:ligatures w14:val="standardContextual"/>
         </w:rPr>
       </w:pPr>
-      <w:hyperlink w:anchor="_Toc244339762" w:history="1">
+      <w:hyperlink w:anchor="_Toc244342754" w:history="1">
         <w:r>
           <w:rPr>
             <w:rStyle w:val="Hyperlink"/>
@@ -1897,7 +1897,7 @@
           <w:rPr>
             <w:webHidden/>
           </w:rPr>
-          <w:instrText xml:space="preserve"> PAGEREF _Toc244339762 \h </w:instrText>
+          <w:instrText xml:space="preserve"> PAGEREF _Toc244342754 \h </w:instrText>
         </w:r>
         <w:r>
           <w:rPr>
@@ -1940,7 +1940,7 @@
           <w14:ligatures w14:val="standardContextual"/>
         </w:rPr>
       </w:pPr>
-      <w:hyperlink w:anchor="_Toc244339763" w:history="1">
+      <w:hyperlink w:anchor="_Toc244342755" w:history="1">
         <w:r>
           <w:rPr>
             <w:rStyle w:val="Hyperlink"/>
@@ -1968,7 +1968,7 @@
             <w:noProof/>
             <w:webHidden/>
           </w:rPr>
-          <w:instrText xml:space="preserve"> PAGEREF _Toc244339763 \h </w:instrText>
+          <w:instrText xml:space="preserve"> PAGEREF _Toc244342755 \h </w:instrText>
         </w:r>
         <w:r>
           <w:rPr>
@@ -2015,7 +2015,7 @@
           <w14:ligatures w14:val="standardContextual"/>
         </w:rPr>
       </w:pPr>
-      <w:hyperlink w:anchor="_Toc244339764" w:history="1">
+      <w:hyperlink w:anchor="_Toc244342756" w:history="1">
         <w:r>
           <w:rPr>
             <w:rStyle w:val="Hyperlink"/>
@@ -2043,7 +2043,7 @@
             <w:noProof/>
             <w:webHidden/>
           </w:rPr>
-          <w:instrText xml:space="preserve"> PAGEREF _Toc244339764 \h </w:instrText>
+          <w:instrText xml:space="preserve"> PAGEREF _Toc244342756 \h </w:instrText>
         </w:r>
         <w:r>
           <w:rPr>
@@ -2090,7 +2090,7 @@
           <w14:ligatures w14:val="standardContextual"/>
         </w:rPr>
       </w:pPr>
-      <w:hyperlink w:anchor="_Toc244339765" w:history="1">
+      <w:hyperlink w:anchor="_Toc244342757" w:history="1">
         <w:r>
           <w:rPr>
             <w:rStyle w:val="Hyperlink"/>
@@ -2118,7 +2118,7 @@
             <w:noProof/>
             <w:webHidden/>
           </w:rPr>
-          <w:instrText xml:space="preserve"> PAGEREF _Toc244339765 \h </w:instrText>
+          <w:instrText xml:space="preserve"> PAGEREF _Toc244342757 \h </w:instrText>
         </w:r>
         <w:r>
           <w:rPr>
@@ -2165,7 +2165,7 @@
           <w14:ligatures w14:val="standardContextual"/>
         </w:rPr>
       </w:pPr>
-      <w:hyperlink w:anchor="_Toc244339766" w:history="1">
+      <w:hyperlink w:anchor="_Toc244342758" w:history="1">
         <w:r>
           <w:rPr>
             <w:rStyle w:val="Hyperlink"/>
@@ -2193,7 +2193,7 @@
             <w:noProof/>
             <w:webHidden/>
           </w:rPr>
-          <w:instrText xml:space="preserve"> PAGEREF _Toc244339766 \h </w:instrText>
+          <w:instrText xml:space="preserve"> PAGEREF _Toc244342758 \h </w:instrText>
         </w:r>
         <w:r>
           <w:rPr>
@@ -2237,7 +2237,7 @@
           <w14:ligatures w14:val="standardContextual"/>
         </w:rPr>
       </w:pPr>
-      <w:hyperlink w:anchor="_Toc244339767" w:history="1">
+      <w:hyperlink w:anchor="_Toc244342759" w:history="1">
         <w:r>
           <w:rPr>
             <w:rStyle w:val="Hyperlink"/>
@@ -2261,7 +2261,7 @@
           <w:rPr>
             <w:webHidden/>
           </w:rPr>
-          <w:instrText xml:space="preserve"> PAGEREF _Toc244339767 \h </w:instrText>
+          <w:instrText xml:space="preserve"> PAGEREF _Toc244342759 \h </w:instrText>
         </w:r>
         <w:r>
           <w:rPr>
@@ -2304,7 +2304,7 @@
           <w14:ligatures w14:val="standardContextual"/>
         </w:rPr>
       </w:pPr>
-      <w:hyperlink w:anchor="_Toc244339768" w:history="1">
+      <w:hyperlink w:anchor="_Toc244342760" w:history="1">
         <w:r>
           <w:rPr>
             <w:rStyle w:val="Hyperlink"/>
@@ -2332,7 +2332,7 @@
             <w:noProof/>
             <w:webHidden/>
           </w:rPr>
-          <w:instrText xml:space="preserve"> PAGEREF _Toc244339768 \h </w:instrText>
+          <w:instrText xml:space="preserve"> PAGEREF _Toc244342760 \h </w:instrText>
         </w:r>
         <w:r>
           <w:rPr>
@@ -2379,7 +2379,7 @@
           <w14:ligatures w14:val="standardContextual"/>
         </w:rPr>
       </w:pPr>
-      <w:hyperlink w:anchor="_Toc244339769" w:history="1">
+      <w:hyperlink w:anchor="_Toc244342761" w:history="1">
         <w:r>
           <w:rPr>
             <w:rStyle w:val="Hyperlink"/>
@@ -2407,7 +2407,7 @@
             <w:noProof/>
             <w:webHidden/>
           </w:rPr>
-          <w:instrText xml:space="preserve"> PAGEREF _Toc244339769 \h </w:instrText>
+          <w:instrText xml:space="preserve"> PAGEREF _Toc244342761 \h </w:instrText>
         </w:r>
         <w:r>
           <w:rPr>
@@ -2454,7 +2454,7 @@
           <w14:ligatures w14:val="standardContextual"/>
         </w:rPr>
       </w:pPr>
-      <w:hyperlink w:anchor="_Toc244339770" w:history="1">
+      <w:hyperlink w:anchor="_Toc244342762" w:history="1">
         <w:r>
           <w:rPr>
             <w:rStyle w:val="Hyperlink"/>
@@ -2482,7 +2482,7 @@
             <w:noProof/>
             <w:webHidden/>
           </w:rPr>
-          <w:instrText xml:space="preserve"> PAGEREF _Toc244339770 \h </w:instrText>
+          <w:instrText xml:space="preserve"> PAGEREF _Toc244342762 \h </w:instrText>
         </w:r>
         <w:r>
           <w:rPr>
@@ -2526,7 +2526,7 @@
           <w14:ligatures w14:val="standardContextual"/>
         </w:rPr>
       </w:pPr>
-      <w:hyperlink w:anchor="_Toc244339771" w:history="1">
+      <w:hyperlink w:anchor="_Toc244342763" w:history="1">
         <w:r>
           <w:rPr>
             <w:rStyle w:val="Hyperlink"/>
@@ -2550,7 +2550,7 @@
           <w:rPr>
             <w:webHidden/>
           </w:rPr>
-          <w:instrText xml:space="preserve"> PAGEREF _Toc244339771 \h </w:instrText>
+          <w:instrText xml:space="preserve"> PAGEREF _Toc244342763 \h </w:instrText>
         </w:r>
         <w:r>
           <w:rPr>
@@ -2590,7 +2590,7 @@
           <w14:ligatures w14:val="standardContextual"/>
         </w:rPr>
       </w:pPr>
-      <w:hyperlink w:anchor="_Toc244339772" w:history="1">
+      <w:hyperlink w:anchor="_Toc244342764" w:history="1">
         <w:r>
           <w:rPr>
             <w:rStyle w:val="Hyperlink"/>
@@ -2614,7 +2614,7 @@
           <w:rPr>
             <w:webHidden/>
           </w:rPr>
-          <w:instrText xml:space="preserve"> PAGEREF _Toc244339772 \h </w:instrText>
+          <w:instrText xml:space="preserve"> PAGEREF _Toc244342764 \h </w:instrText>
         </w:r>
         <w:r>
           <w:rPr>
@@ -2655,7 +2655,7 @@
           <w14:ligatures w14:val="standardContextual"/>
         </w:rPr>
       </w:pPr>
-      <w:hyperlink w:anchor="_Toc244339773" w:history="1">
+      <w:hyperlink w:anchor="_Toc244342765" w:history="1">
         <w:r>
           <w:rPr>
             <w:rStyle w:val="Hyperlink"/>
@@ -2679,7 +2679,7 @@
           <w:rPr>
             <w:webHidden/>
           </w:rPr>
-          <w:instrText xml:space="preserve"> PAGEREF _Toc244339773 \h </w:instrText>
+          <w:instrText xml:space="preserve"> PAGEREF _Toc244342765 \h </w:instrText>
         </w:r>
         <w:r>
           <w:rPr>
@@ -2719,7 +2719,7 @@
           <w14:ligatures w14:val="standardContextual"/>
         </w:rPr>
       </w:pPr>
-      <w:hyperlink w:anchor="_Toc244339774" w:history="1">
+      <w:hyperlink w:anchor="_Toc244342766" w:history="1">
         <w:r>
           <w:rPr>
             <w:rStyle w:val="Hyperlink"/>
@@ -2743,7 +2743,7 @@
           <w:rPr>
             <w:webHidden/>
           </w:rPr>
-          <w:instrText xml:space="preserve"> PAGEREF _Toc244339774 \h </w:instrText>
+          <w:instrText xml:space="preserve"> PAGEREF _Toc244342766 \h </w:instrText>
         </w:r>
         <w:r>
           <w:rPr>
@@ -2783,7 +2783,7 @@
           <w14:ligatures w14:val="standardContextual"/>
         </w:rPr>
       </w:pPr>
-      <w:hyperlink w:anchor="_Toc244339775" w:history="1">
+      <w:hyperlink w:anchor="_Toc244342767" w:history="1">
         <w:r>
           <w:rPr>
             <w:rStyle w:val="Hyperlink"/>
@@ -2807,7 +2807,7 @@
           <w:rPr>
             <w:webHidden/>
           </w:rPr>
-          <w:instrText xml:space="preserve"> PAGEREF _Toc244339775 \h </w:instrText>
+          <w:instrText xml:space="preserve"> PAGEREF _Toc244342767 \h </w:instrText>
         </w:r>
         <w:r>
           <w:rPr>
@@ -2847,7 +2847,7 @@
           <w14:ligatures w14:val="standardContextual"/>
         </w:rPr>
       </w:pPr>
-      <w:hyperlink w:anchor="_Toc244339776" w:history="1">
+      <w:hyperlink w:anchor="_Toc244342768" w:history="1">
         <w:r>
           <w:rPr>
             <w:rStyle w:val="Hyperlink"/>
@@ -2871,7 +2871,7 @@
           <w:rPr>
             <w:webHidden/>
           </w:rPr>
-          <w:instrText xml:space="preserve"> PAGEREF _Toc244339776 \h </w:instrText>
+          <w:instrText xml:space="preserve"> PAGEREF _Toc244342768 \h </w:instrText>
         </w:r>
         <w:r>
           <w:rPr>
@@ -2914,7 +2914,7 @@
           <w14:ligatures w14:val="standardContextual"/>
         </w:rPr>
       </w:pPr>
-      <w:hyperlink w:anchor="_Toc244339777" w:history="1">
+      <w:hyperlink w:anchor="_Toc244342769" w:history="1">
         <w:r>
           <w:rPr>
             <w:rStyle w:val="Hyperlink"/>
@@ -2942,7 +2942,7 @@
             <w:noProof/>
             <w:webHidden/>
           </w:rPr>
-          <w:instrText xml:space="preserve"> PAGEREF _Toc244339777 \h </w:instrText>
+          <w:instrText xml:space="preserve"> PAGEREF _Toc244342769 \h </w:instrText>
         </w:r>
         <w:r>
           <w:rPr>
@@ -2989,7 +2989,7 @@
           <w14:ligatures w14:val="standardContextual"/>
         </w:rPr>
       </w:pPr>
-      <w:hyperlink w:anchor="_Toc244339778" w:history="1">
+      <w:hyperlink w:anchor="_Toc244342770" w:history="1">
         <w:r>
           <w:rPr>
             <w:rStyle w:val="Hyperlink"/>
@@ -3017,7 +3017,7 @@
             <w:noProof/>
             <w:webHidden/>
           </w:rPr>
-          <w:instrText xml:space="preserve"> PAGEREF _Toc244339778 \h </w:instrText>
+          <w:instrText xml:space="preserve"> PAGEREF _Toc244342770 \h </w:instrText>
         </w:r>
         <w:r>
           <w:rPr>
@@ -3064,7 +3064,7 @@
           <w14:ligatures w14:val="standardContextual"/>
         </w:rPr>
       </w:pPr>
-      <w:hyperlink w:anchor="_Toc244339779" w:history="1">
+      <w:hyperlink w:anchor="_Toc244342771" w:history="1">
         <w:r>
           <w:rPr>
             <w:rStyle w:val="Hyperlink"/>
@@ -3092,7 +3092,7 @@
             <w:noProof/>
             <w:webHidden/>
           </w:rPr>
-          <w:instrText xml:space="preserve"> PAGEREF _Toc244339779 \h </w:instrText>
+          <w:instrText xml:space="preserve"> PAGEREF _Toc244342771 \h </w:instrText>
         </w:r>
         <w:r>
           <w:rPr>
@@ -3136,7 +3136,7 @@
           <w14:ligatures w14:val="standardContextual"/>
         </w:rPr>
       </w:pPr>
-      <w:hyperlink w:anchor="_Toc244339780" w:history="1">
+      <w:hyperlink w:anchor="_Toc244342772" w:history="1">
         <w:r>
           <w:rPr>
             <w:rStyle w:val="Hyperlink"/>
@@ -3160,7 +3160,7 @@
           <w:rPr>
             <w:webHidden/>
           </w:rPr>
-          <w:instrText xml:space="preserve"> PAGEREF _Toc244339780 \h </w:instrText>
+          <w:instrText xml:space="preserve"> PAGEREF _Toc244342772 \h </w:instrText>
         </w:r>
         <w:r>
           <w:rPr>
@@ -3200,7 +3200,7 @@
           <w14:ligatures w14:val="standardContextual"/>
         </w:rPr>
       </w:pPr>
-      <w:hyperlink w:anchor="_Toc244339781" w:history="1">
+      <w:hyperlink w:anchor="_Toc244342773" w:history="1">
         <w:r>
           <w:rPr>
             <w:rStyle w:val="Hyperlink"/>
@@ -3224,7 +3224,7 @@
           <w:rPr>
             <w:webHidden/>
           </w:rPr>
-          <w:instrText xml:space="preserve"> PAGEREF _Toc244339781 \h </w:instrText>
+          <w:instrText xml:space="preserve"> PAGEREF _Toc244342773 \h </w:instrText>
         </w:r>
         <w:r>
           <w:rPr>
@@ -3264,7 +3264,7 @@
           <w14:ligatures w14:val="standardContextual"/>
         </w:rPr>
       </w:pPr>
-      <w:hyperlink w:anchor="_Toc244339782" w:history="1">
+      <w:hyperlink w:anchor="_Toc244342774" w:history="1">
         <w:r>
           <w:rPr>
             <w:rStyle w:val="Hyperlink"/>
@@ -3288,7 +3288,7 @@
           <w:rPr>
             <w:webHidden/>
           </w:rPr>
-          <w:instrText xml:space="preserve"> PAGEREF _Toc244339782 \h </w:instrText>
+          <w:instrText xml:space="preserve"> PAGEREF _Toc244342774 \h </w:instrText>
         </w:r>
         <w:r>
           <w:rPr>
@@ -3331,7 +3331,7 @@
           <w14:ligatures w14:val="standardContextual"/>
         </w:rPr>
       </w:pPr>
-      <w:hyperlink w:anchor="_Toc244339783" w:history="1">
+      <w:hyperlink w:anchor="_Toc244342775" w:history="1">
         <w:r>
           <w:rPr>
             <w:rStyle w:val="Hyperlink"/>
@@ -3359,7 +3359,7 @@
             <w:noProof/>
             <w:webHidden/>
           </w:rPr>
-          <w:instrText xml:space="preserve"> PAGEREF _Toc244339783 \h </w:instrText>
+          <w:instrText xml:space="preserve"> PAGEREF _Toc244342775 \h </w:instrText>
         </w:r>
         <w:r>
           <w:rPr>
@@ -3406,7 +3406,7 @@
           <w14:ligatures w14:val="standardContextual"/>
         </w:rPr>
       </w:pPr>
-      <w:hyperlink w:anchor="_Toc244339784" w:history="1">
+      <w:hyperlink w:anchor="_Toc244342776" w:history="1">
         <w:r>
           <w:rPr>
             <w:rStyle w:val="Hyperlink"/>
@@ -3434,7 +3434,7 @@
             <w:noProof/>
             <w:webHidden/>
           </w:rPr>
-          <w:instrText xml:space="preserve"> PAGEREF _Toc244339784 \h </w:instrText>
+          <w:instrText xml:space="preserve"> PAGEREF _Toc244342776 \h </w:instrText>
         </w:r>
         <w:r>
           <w:rPr>
@@ -3481,14 +3481,14 @@
           <w14:ligatures w14:val="standardContextual"/>
         </w:rPr>
       </w:pPr>
-      <w:hyperlink w:anchor="_Toc244339785" w:history="1">
+      <w:hyperlink w:anchor="_Toc244342777" w:history="1">
         <w:r>
           <w:rPr>
             <w:rStyle w:val="Hyperlink"/>
             <w:rFonts w:eastAsia="Times New Roman"/>
             <w:noProof/>
           </w:rPr>
-          <w:t>3.6.3. Lớp 3 - Khởi động trước phiên TLS ở pha va chạm (Pre-Warm TLS)</w:t>
+          <w:t>3.6.3. Lớp 3 - Thiết lập kết nối trước (Pre-warming)</w:t>
         </w:r>
         <w:r>
           <w:rPr>
@@ -3509,7 +3509,7 @@
             <w:noProof/>
             <w:webHidden/>
           </w:rPr>
-          <w:instrText xml:space="preserve"> PAGEREF _Toc244339785 \h </w:instrText>
+          <w:instrText xml:space="preserve"> PAGEREF _Toc244342777 \h </w:instrText>
         </w:r>
         <w:r>
           <w:rPr>
@@ -3556,7 +3556,7 @@
           <w14:ligatures w14:val="standardContextual"/>
         </w:rPr>
       </w:pPr>
-      <w:hyperlink w:anchor="_Toc244339786" w:history="1">
+      <w:hyperlink w:anchor="_Toc244342778" w:history="1">
         <w:r>
           <w:rPr>
             <w:rStyle w:val="Hyperlink"/>
@@ -3584,7 +3584,7 @@
             <w:noProof/>
             <w:webHidden/>
           </w:rPr>
-          <w:instrText xml:space="preserve"> PAGEREF _Toc244339786 \h </w:instrText>
+          <w:instrText xml:space="preserve"> PAGEREF _Toc244342778 \h </w:instrText>
         </w:r>
         <w:r>
           <w:rPr>
@@ -3631,7 +3631,7 @@
           <w14:ligatures w14:val="standardContextual"/>
         </w:rPr>
       </w:pPr>
-      <w:hyperlink w:anchor="_Toc244339787" w:history="1">
+      <w:hyperlink w:anchor="_Toc244342779" w:history="1">
         <w:r>
           <w:rPr>
             <w:rStyle w:val="Hyperlink"/>
@@ -3659,7 +3659,7 @@
             <w:noProof/>
             <w:webHidden/>
           </w:rPr>
-          <w:instrText xml:space="preserve"> PAGEREF _Toc244339787 \h </w:instrText>
+          <w:instrText xml:space="preserve"> PAGEREF _Toc244342779 \h </w:instrText>
         </w:r>
         <w:r>
           <w:rPr>
@@ -3703,7 +3703,7 @@
           <w14:ligatures w14:val="standardContextual"/>
         </w:rPr>
       </w:pPr>
-      <w:hyperlink w:anchor="_Toc244339788" w:history="1">
+      <w:hyperlink w:anchor="_Toc244342780" w:history="1">
         <w:r>
           <w:rPr>
             <w:rStyle w:val="Hyperlink"/>
@@ -3727,7 +3727,7 @@
           <w:rPr>
             <w:webHidden/>
           </w:rPr>
-          <w:instrText xml:space="preserve"> PAGEREF _Toc244339788 \h </w:instrText>
+          <w:instrText xml:space="preserve"> PAGEREF _Toc244342780 \h </w:instrText>
         </w:r>
         <w:r>
           <w:rPr>
@@ -3770,7 +3770,7 @@
           <w14:ligatures w14:val="standardContextual"/>
         </w:rPr>
       </w:pPr>
-      <w:hyperlink w:anchor="_Toc244339789" w:history="1">
+      <w:hyperlink w:anchor="_Toc244342781" w:history="1">
         <w:r>
           <w:rPr>
             <w:rStyle w:val="Hyperlink"/>
@@ -3798,7 +3798,7 @@
             <w:noProof/>
             <w:webHidden/>
           </w:rPr>
-          <w:instrText xml:space="preserve"> PAGEREF _Toc244339789 \h </w:instrText>
+          <w:instrText xml:space="preserve"> PAGEREF _Toc244342781 \h </w:instrText>
         </w:r>
         <w:r>
           <w:rPr>
@@ -3845,7 +3845,7 @@
           <w14:ligatures w14:val="standardContextual"/>
         </w:rPr>
       </w:pPr>
-      <w:hyperlink w:anchor="_Toc244339790" w:history="1">
+      <w:hyperlink w:anchor="_Toc244342782" w:history="1">
         <w:r>
           <w:rPr>
             <w:rStyle w:val="Hyperlink"/>
@@ -3873,7 +3873,7 @@
             <w:noProof/>
             <w:webHidden/>
           </w:rPr>
-          <w:instrText xml:space="preserve"> PAGEREF _Toc244339790 \h </w:instrText>
+          <w:instrText xml:space="preserve"> PAGEREF _Toc244342782 \h </w:instrText>
         </w:r>
         <w:r>
           <w:rPr>
@@ -3920,7 +3920,7 @@
           <w14:ligatures w14:val="standardContextual"/>
         </w:rPr>
       </w:pPr>
-      <w:hyperlink w:anchor="_Toc244339791" w:history="1">
+      <w:hyperlink w:anchor="_Toc244342783" w:history="1">
         <w:r>
           <w:rPr>
             <w:rStyle w:val="Hyperlink"/>
@@ -3948,7 +3948,7 @@
             <w:noProof/>
             <w:webHidden/>
           </w:rPr>
-          <w:instrText xml:space="preserve"> PAGEREF _Toc244339791 \h </w:instrText>
+          <w:instrText xml:space="preserve"> PAGEREF _Toc244342783 \h </w:instrText>
         </w:r>
         <w:r>
           <w:rPr>
@@ -3995,7 +3995,7 @@
           <w14:ligatures w14:val="standardContextual"/>
         </w:rPr>
       </w:pPr>
-      <w:hyperlink w:anchor="_Toc244339792" w:history="1">
+      <w:hyperlink w:anchor="_Toc244342784" w:history="1">
         <w:r>
           <w:rPr>
             <w:rStyle w:val="Hyperlink"/>
@@ -4023,7 +4023,7 @@
             <w:noProof/>
             <w:webHidden/>
           </w:rPr>
-          <w:instrText xml:space="preserve"> PAGEREF _Toc244339792 \h </w:instrText>
+          <w:instrText xml:space="preserve"> PAGEREF _Toc244342784 \h </w:instrText>
         </w:r>
         <w:r>
           <w:rPr>
@@ -4070,7 +4070,7 @@
           <w14:ligatures w14:val="standardContextual"/>
         </w:rPr>
       </w:pPr>
-      <w:hyperlink w:anchor="_Toc244339793" w:history="1">
+      <w:hyperlink w:anchor="_Toc244342785" w:history="1">
         <w:r>
           <w:rPr>
             <w:rStyle w:val="Hyperlink"/>
@@ -4098,7 +4098,7 @@
             <w:noProof/>
             <w:webHidden/>
           </w:rPr>
-          <w:instrText xml:space="preserve"> PAGEREF _Toc244339793 \h </w:instrText>
+          <w:instrText xml:space="preserve"> PAGEREF _Toc244342785 \h </w:instrText>
         </w:r>
         <w:r>
           <w:rPr>
@@ -4142,7 +4142,7 @@
           <w14:ligatures w14:val="standardContextual"/>
         </w:rPr>
       </w:pPr>
-      <w:hyperlink w:anchor="_Toc244339794" w:history="1">
+      <w:hyperlink w:anchor="_Toc244342786" w:history="1">
         <w:r>
           <w:rPr>
             <w:rStyle w:val="Hyperlink"/>
@@ -4166,7 +4166,7 @@
           <w:rPr>
             <w:webHidden/>
           </w:rPr>
-          <w:instrText xml:space="preserve"> PAGEREF _Toc244339794 \h </w:instrText>
+          <w:instrText xml:space="preserve"> PAGEREF _Toc244342786 \h </w:instrText>
         </w:r>
         <w:r>
           <w:rPr>
@@ -4209,7 +4209,7 @@
           <w14:ligatures w14:val="standardContextual"/>
         </w:rPr>
       </w:pPr>
-      <w:hyperlink w:anchor="_Toc244339795" w:history="1">
+      <w:hyperlink w:anchor="_Toc244342787" w:history="1">
         <w:r>
           <w:rPr>
             <w:rStyle w:val="Hyperlink"/>
@@ -4237,7 +4237,7 @@
             <w:noProof/>
             <w:webHidden/>
           </w:rPr>
-          <w:instrText xml:space="preserve"> PAGEREF _Toc244339795 \h </w:instrText>
+          <w:instrText xml:space="preserve"> PAGEREF _Toc244342787 \h </w:instrText>
         </w:r>
         <w:r>
           <w:rPr>
@@ -4284,7 +4284,7 @@
           <w14:ligatures w14:val="standardContextual"/>
         </w:rPr>
       </w:pPr>
-      <w:hyperlink w:anchor="_Toc244339796" w:history="1">
+      <w:hyperlink w:anchor="_Toc244342788" w:history="1">
         <w:r>
           <w:rPr>
             <w:rStyle w:val="Hyperlink"/>
@@ -4312,7 +4312,7 @@
             <w:noProof/>
             <w:webHidden/>
           </w:rPr>
-          <w:instrText xml:space="preserve"> PAGEREF _Toc244339796 \h </w:instrText>
+          <w:instrText xml:space="preserve"> PAGEREF _Toc244342788 \h </w:instrText>
         </w:r>
         <w:r>
           <w:rPr>
@@ -4359,7 +4359,7 @@
           <w14:ligatures w14:val="standardContextual"/>
         </w:rPr>
       </w:pPr>
-      <w:hyperlink w:anchor="_Toc244339797" w:history="1">
+      <w:hyperlink w:anchor="_Toc244342789" w:history="1">
         <w:r>
           <w:rPr>
             <w:rStyle w:val="Hyperlink"/>
@@ -4387,7 +4387,7 @@
             <w:noProof/>
             <w:webHidden/>
           </w:rPr>
-          <w:instrText xml:space="preserve"> PAGEREF _Toc244339797 \h </w:instrText>
+          <w:instrText xml:space="preserve"> PAGEREF _Toc244342789 \h </w:instrText>
         </w:r>
         <w:r>
           <w:rPr>
@@ -4434,7 +4434,7 @@
           <w14:ligatures w14:val="standardContextual"/>
         </w:rPr>
       </w:pPr>
-      <w:hyperlink w:anchor="_Toc244339798" w:history="1">
+      <w:hyperlink w:anchor="_Toc244342790" w:history="1">
         <w:r>
           <w:rPr>
             <w:rStyle w:val="Hyperlink"/>
@@ -4462,7 +4462,7 @@
             <w:noProof/>
             <w:webHidden/>
           </w:rPr>
-          <w:instrText xml:space="preserve"> PAGEREF _Toc244339798 \h </w:instrText>
+          <w:instrText xml:space="preserve"> PAGEREF _Toc244342790 \h </w:instrText>
         </w:r>
         <w:r>
           <w:rPr>
@@ -4482,7 +4482,7 @@
             <w:noProof/>
             <w:webHidden/>
           </w:rPr>
-          <w:t>62</w:t>
+          <w:t>63</w:t>
         </w:r>
         <w:r>
           <w:rPr>
@@ -4506,7 +4506,7 @@
           <w14:ligatures w14:val="standardContextual"/>
         </w:rPr>
       </w:pPr>
-      <w:hyperlink w:anchor="_Toc244339799" w:history="1">
+      <w:hyperlink w:anchor="_Toc244342791" w:history="1">
         <w:r>
           <w:rPr>
             <w:rStyle w:val="Hyperlink"/>
@@ -4530,7 +4530,7 @@
           <w:rPr>
             <w:webHidden/>
           </w:rPr>
-          <w:instrText xml:space="preserve"> PAGEREF _Toc244339799 \h </w:instrText>
+          <w:instrText xml:space="preserve"> PAGEREF _Toc244342791 \h </w:instrText>
         </w:r>
         <w:r>
           <w:rPr>
@@ -4571,7 +4571,7 @@
           <w14:ligatures w14:val="standardContextual"/>
         </w:rPr>
       </w:pPr>
-      <w:hyperlink w:anchor="_Toc244339800" w:history="1">
+      <w:hyperlink w:anchor="_Toc244342792" w:history="1">
         <w:r>
           <w:rPr>
             <w:rStyle w:val="Hyperlink"/>
@@ -4595,7 +4595,7 @@
           <w:rPr>
             <w:webHidden/>
           </w:rPr>
-          <w:instrText xml:space="preserve"> PAGEREF _Toc244339800 \h </w:instrText>
+          <w:instrText xml:space="preserve"> PAGEREF _Toc244342792 \h </w:instrText>
         </w:r>
         <w:r>
           <w:rPr>
@@ -4636,7 +4636,7 @@
           <w14:ligatures w14:val="standardContextual"/>
         </w:rPr>
       </w:pPr>
-      <w:hyperlink w:anchor="_Toc244339801" w:history="1">
+      <w:hyperlink w:anchor="_Toc244342793" w:history="1">
         <w:r>
           <w:rPr>
             <w:rStyle w:val="Hyperlink"/>
@@ -4660,7 +4660,7 @@
           <w:rPr>
             <w:webHidden/>
           </w:rPr>
-          <w:instrText xml:space="preserve"> PAGEREF _Toc244339801 \h </w:instrText>
+          <w:instrText xml:space="preserve"> PAGEREF _Toc244342793 \h </w:instrText>
         </w:r>
         <w:r>
           <w:rPr>
@@ -4701,7 +4701,7 @@
           <w14:ligatures w14:val="standardContextual"/>
         </w:rPr>
       </w:pPr>
-      <w:hyperlink w:anchor="_Toc244339802" w:history="1">
+      <w:hyperlink w:anchor="_Toc244342794" w:history="1">
         <w:r>
           <w:rPr>
             <w:rStyle w:val="Hyperlink"/>
@@ -4725,7 +4725,7 @@
           <w:rPr>
             <w:webHidden/>
           </w:rPr>
-          <w:instrText xml:space="preserve"> PAGEREF _Toc244339802 \h </w:instrText>
+          <w:instrText xml:space="preserve"> PAGEREF _Toc244342794 \h </w:instrText>
         </w:r>
         <w:r>
           <w:rPr>
@@ -4765,7 +4765,7 @@
           <w14:ligatures w14:val="standardContextual"/>
         </w:rPr>
       </w:pPr>
-      <w:hyperlink w:anchor="_Toc244339803" w:history="1">
+      <w:hyperlink w:anchor="_Toc244342795" w:history="1">
         <w:r>
           <w:rPr>
             <w:rStyle w:val="Hyperlink"/>
@@ -4789,7 +4789,7 @@
           <w:rPr>
             <w:webHidden/>
           </w:rPr>
-          <w:instrText xml:space="preserve"> PAGEREF _Toc244339803 \h </w:instrText>
+          <w:instrText xml:space="preserve"> PAGEREF _Toc244342795 \h </w:instrText>
         </w:r>
         <w:r>
           <w:rPr>
@@ -4829,7 +4829,7 @@
           <w14:ligatures w14:val="standardContextual"/>
         </w:rPr>
       </w:pPr>
-      <w:hyperlink w:anchor="_Toc244339804" w:history="1">
+      <w:hyperlink w:anchor="_Toc244342796" w:history="1">
         <w:r>
           <w:rPr>
             <w:rStyle w:val="Hyperlink"/>
@@ -4853,7 +4853,7 @@
           <w:rPr>
             <w:webHidden/>
           </w:rPr>
-          <w:instrText xml:space="preserve"> PAGEREF _Toc244339804 \h </w:instrText>
+          <w:instrText xml:space="preserve"> PAGEREF _Toc244342796 \h </w:instrText>
         </w:r>
         <w:r>
           <w:rPr>
@@ -4894,7 +4894,7 @@
           <w14:ligatures w14:val="standardContextual"/>
         </w:rPr>
       </w:pPr>
-      <w:hyperlink w:anchor="_Toc244339805" w:history="1">
+      <w:hyperlink w:anchor="_Toc244342797" w:history="1">
         <w:r>
           <w:rPr>
             <w:rStyle w:val="Hyperlink"/>
@@ -4918,7 +4918,7 @@
           <w:rPr>
             <w:webHidden/>
           </w:rPr>
-          <w:instrText xml:space="preserve"> PAGEREF _Toc244339805 \h </w:instrText>
+          <w:instrText xml:space="preserve"> PAGEREF _Toc244342797 \h </w:instrText>
         </w:r>
         <w:r>
           <w:rPr>
@@ -4959,7 +4959,7 @@
           <w14:ligatures w14:val="standardContextual"/>
         </w:rPr>
       </w:pPr>
-      <w:hyperlink w:anchor="_Toc244339806" w:history="1">
+      <w:hyperlink w:anchor="_Toc244342798" w:history="1">
         <w:r>
           <w:rPr>
             <w:rStyle w:val="Hyperlink"/>
@@ -4983,7 +4983,7 @@
           <w:rPr>
             <w:webHidden/>
           </w:rPr>
-          <w:instrText xml:space="preserve"> PAGEREF _Toc244339806 \h </w:instrText>
+          <w:instrText xml:space="preserve"> PAGEREF _Toc244342798 \h </w:instrText>
         </w:r>
         <w:r>
           <w:rPr>
@@ -5033,7 +5033,7 @@
         <w:spacing w:before="120" w:after="240"/>
         <w:jc w:val="center"/>
       </w:pPr>
-      <w:bookmarkStart w:id="1" w:name="_Toc244339744"/>
+      <w:bookmarkStart w:id="1" w:name="_Toc244342736"/>
       <w:r>
         <w:rPr>
           <w:rFonts w:eastAsia="Times New Roman" w:cs="Times New Roman"/>
@@ -5470,7 +5470,7 @@
           <w:sz w:val="24"/>
           <w:szCs w:val="24"/>
         </w:rPr>
-        <w:t>58</w:t>
+        <w:t>59</w:t>
       </w:r>
     </w:p>
     <w:p>
@@ -5484,7 +5484,7 @@
         <w:spacing w:before="120" w:after="240"/>
         <w:jc w:val="center"/>
       </w:pPr>
-      <w:bookmarkStart w:id="2" w:name="_Toc244339745"/>
+      <w:bookmarkStart w:id="2" w:name="_Toc244342737"/>
       <w:r>
         <w:rPr>
           <w:rFonts w:eastAsia="Times New Roman" w:cs="Times New Roman"/>
@@ -5624,7 +5624,7 @@
           <w:sz w:val="24"/>
           <w:szCs w:val="24"/>
         </w:rPr>
-        <w:t>24</w:t>
+        <w:t>25</w:t>
       </w:r>
     </w:p>
     <w:p>
@@ -6086,7 +6086,7 @@
           <w:sz w:val="24"/>
           <w:szCs w:val="24"/>
         </w:rPr>
-        <w:t>59</w:t>
+        <w:t>60</w:t>
       </w:r>
     </w:p>
     <w:p>
@@ -6119,7 +6119,7 @@
           <w:sz w:val="24"/>
           <w:szCs w:val="24"/>
         </w:rPr>
-        <w:t>60</w:t>
+        <w:t>61</w:t>
       </w:r>
     </w:p>
     <w:p>
@@ -6185,7 +6185,7 @@
           <w:sz w:val="24"/>
           <w:szCs w:val="24"/>
         </w:rPr>
-        <w:t>62</w:t>
+        <w:t>63</w:t>
       </w:r>
     </w:p>
     <w:p>
@@ -6218,7 +6218,7 @@
           <w:sz w:val="24"/>
           <w:szCs w:val="24"/>
         </w:rPr>
-        <w:t>63</w:t>
+        <w:t>64</w:t>
       </w:r>
     </w:p>
     <w:p>
@@ -6266,7 +6266,7 @@
         <w:spacing w:before="120" w:after="240"/>
         <w:jc w:val="center"/>
       </w:pPr>
-      <w:bookmarkStart w:id="3" w:name="_Toc244339746"/>
+      <w:bookmarkStart w:id="3" w:name="_Toc244342738"/>
       <w:r>
         <w:rPr>
           <w:rFonts w:eastAsia="Times New Roman" w:cs="Times New Roman"/>
@@ -7722,7 +7722,7 @@
         <w:spacing w:before="120" w:after="240"/>
         <w:jc w:val="center"/>
       </w:pPr>
-      <w:bookmarkStart w:id="4" w:name="_Toc244339747"/>
+      <w:bookmarkStart w:id="4" w:name="_Toc244342739"/>
       <w:r>
         <w:rPr>
           <w:rFonts w:eastAsia="Times New Roman" w:cs="Times New Roman"/>
@@ -7792,7 +7792,7 @@
         <w:spacing w:before="120" w:after="240"/>
         <w:jc w:val="center"/>
       </w:pPr>
-      <w:bookmarkStart w:id="5" w:name="_Toc244339748"/>
+      <w:bookmarkStart w:id="5" w:name="_Toc244342740"/>
       <w:r>
         <w:rPr>
           <w:rFonts w:eastAsia="Times New Roman" w:cs="Times New Roman"/>
@@ -7808,7 +7808,7 @@
         <w:spacing w:before="200" w:after="120"/>
         <w:jc w:val="left"/>
       </w:pPr>
-      <w:bookmarkStart w:id="6" w:name="_Toc244339749"/>
+      <w:bookmarkStart w:id="6" w:name="_Toc244342741"/>
       <w:r>
         <w:rPr>
           <w:rFonts w:eastAsia="Times New Roman" w:cs="Times New Roman"/>
@@ -7961,7 +7961,7 @@
         <w:spacing w:before="200" w:after="120"/>
         <w:jc w:val="left"/>
       </w:pPr>
-      <w:bookmarkStart w:id="7" w:name="_Toc244339750"/>
+      <w:bookmarkStart w:id="7" w:name="_Toc244342742"/>
       <w:r>
         <w:rPr>
           <w:rFonts w:eastAsia="Times New Roman" w:cs="Times New Roman"/>
@@ -7977,7 +7977,7 @@
         <w:spacing w:before="160" w:after="80"/>
         <w:jc w:val="left"/>
       </w:pPr>
-      <w:bookmarkStart w:id="8" w:name="_Toc244339751"/>
+      <w:bookmarkStart w:id="8" w:name="_Toc244342743"/>
       <w:r>
         <w:rPr>
           <w:rFonts w:eastAsia="Times New Roman" w:cs="Times New Roman"/>
@@ -8033,7 +8033,7 @@
         <w:spacing w:before="160" w:after="80"/>
         <w:jc w:val="left"/>
       </w:pPr>
-      <w:bookmarkStart w:id="9" w:name="_Toc244339752"/>
+      <w:bookmarkStart w:id="9" w:name="_Toc244342744"/>
       <w:r>
         <w:rPr>
           <w:rFonts w:eastAsia="Times New Roman" w:cs="Times New Roman"/>
@@ -8435,7 +8435,7 @@
                 <w:sz w:val="23"/>
                 <w:szCs w:val="23"/>
               </w:rPr>
-              <w:t>Nhấn mạnh vai trò bắt buộc của pha lắng (Settle), kiểm tra bất động sau ngã và góc lệch tư thế ≥ 45° để chống báo giả</w:t>
+              <w:t>Nhấn mạnh vai trò bắt buộc của pha ổn định (settling), kiểm tra bất động sau ngã và góc lệch tư thế ≥ 45° để chống báo giả</w:t>
             </w:r>
           </w:p>
         </w:tc>
@@ -8713,7 +8713,7 @@
         <w:spacing w:before="200" w:after="120"/>
         <w:jc w:val="left"/>
       </w:pPr>
-      <w:bookmarkStart w:id="10" w:name="_Toc244339753"/>
+      <w:bookmarkStart w:id="10" w:name="_Toc244342745"/>
       <w:r>
         <w:rPr>
           <w:rFonts w:eastAsia="Times New Roman" w:cs="Times New Roman"/>
@@ -8729,7 +8729,7 @@
         <w:spacing w:before="160" w:after="80"/>
         <w:jc w:val="left"/>
       </w:pPr>
-      <w:bookmarkStart w:id="11" w:name="_Toc244339754"/>
+      <w:bookmarkStart w:id="11" w:name="_Toc244342746"/>
       <w:r>
         <w:rPr>
           <w:rFonts w:eastAsia="Times New Roman" w:cs="Times New Roman"/>
@@ -8875,7 +8875,15 @@
           <w:rFonts w:eastAsia="Times New Roman"/>
           <w:szCs w:val="26"/>
         </w:rPr>
-        <w:t>Xây dựng đường truyền cảnh báo độ trễ thấp 5 lớp (UDP nội mạng, BLE không chặn, Pre-Warm TLS, Fast-Flush Firebase, đua đa kênh) và ứng dụng di động «Báo Ngã IoT» cho Android/iOS hợp nhất cảnh báo từ vòng đeo và Camera AI.</w:t>
+        <w:t xml:space="preserve">Xây dựng đường truyền cảnh báo độ trễ thấp 5 lớp (UDP nội mạng, BLE không chặn, thiết lập kết nối trước (connection pre-warming), Fast-Flush Firebase, đua đa kênh) và ứng </w:t>
+      </w:r>
+      <w:r>
+        <w:rPr>
+          <w:rFonts w:eastAsia="Times New Roman"/>
+          <w:szCs w:val="26"/>
+        </w:rPr>
+        <w:lastRenderedPageBreak/>
+        <w:t>dụng di động «Báo Ngã IoT» cho Android/iOS hợp nhất cảnh báo từ vòng đeo và Camera AI.</w:t>
       </w:r>
     </w:p>
     <w:p>
@@ -8884,13 +8892,12 @@
         <w:spacing w:before="160" w:after="80"/>
         <w:jc w:val="left"/>
       </w:pPr>
-      <w:bookmarkStart w:id="12" w:name="_Toc244339755"/>
+      <w:bookmarkStart w:id="12" w:name="_Toc244342747"/>
       <w:r>
         <w:rPr>
           <w:rFonts w:eastAsia="Times New Roman" w:cs="Times New Roman"/>
           <w:szCs w:val="26"/>
         </w:rPr>
-        <w:lastRenderedPageBreak/>
         <w:t>1.3.2. Đối tượng và phạm vi nghiên cứu</w:t>
       </w:r>
       <w:bookmarkEnd w:id="12"/>
@@ -8927,7 +8934,7 @@
         <w:spacing w:before="200" w:after="120"/>
         <w:jc w:val="left"/>
       </w:pPr>
-      <w:bookmarkStart w:id="13" w:name="_Toc244339756"/>
+      <w:bookmarkStart w:id="13" w:name="_Toc244342748"/>
       <w:r>
         <w:rPr>
           <w:rFonts w:eastAsia="Times New Roman" w:cs="Times New Roman"/>
@@ -8943,7 +8950,7 @@
         <w:spacing w:before="160" w:after="80"/>
         <w:jc w:val="left"/>
       </w:pPr>
-      <w:bookmarkStart w:id="14" w:name="_Toc244339757"/>
+      <w:bookmarkStart w:id="14" w:name="_Toc244342749"/>
       <w:r>
         <w:rPr>
           <w:rFonts w:eastAsia="Times New Roman" w:cs="Times New Roman"/>
@@ -9122,7 +9129,7 @@
         <w:spacing w:before="160" w:after="80"/>
         <w:jc w:val="left"/>
       </w:pPr>
-      <w:bookmarkStart w:id="15" w:name="_Toc244339758"/>
+      <w:bookmarkStart w:id="15" w:name="_Toc244342750"/>
       <w:r>
         <w:rPr>
           <w:rFonts w:eastAsia="Times New Roman" w:cs="Times New Roman"/>
@@ -10426,7 +10433,7 @@
         <w:spacing w:before="160" w:after="80"/>
         <w:jc w:val="left"/>
       </w:pPr>
-      <w:bookmarkStart w:id="16" w:name="_Toc244339759"/>
+      <w:bookmarkStart w:id="16" w:name="_Toc244342751"/>
       <w:r>
         <w:rPr>
           <w:rFonts w:eastAsia="Times New Roman" w:cs="Times New Roman"/>
@@ -10573,7 +10580,7 @@
         <w:spacing w:before="120" w:after="240"/>
         <w:jc w:val="center"/>
       </w:pPr>
-      <w:bookmarkStart w:id="17" w:name="_Toc244339760"/>
+      <w:bookmarkStart w:id="17" w:name="_Toc244342752"/>
       <w:r>
         <w:rPr>
           <w:rFonts w:eastAsia="Times New Roman" w:cs="Times New Roman"/>
@@ -10590,7 +10597,7 @@
         <w:spacing w:before="200" w:after="120"/>
         <w:jc w:val="left"/>
       </w:pPr>
-      <w:bookmarkStart w:id="18" w:name="_Toc244339761"/>
+      <w:bookmarkStart w:id="18" w:name="_Toc244342753"/>
       <w:r>
         <w:rPr>
           <w:rFonts w:eastAsia="Times New Roman" w:cs="Times New Roman"/>
@@ -10760,7 +10767,7 @@
         <w:spacing w:before="200" w:after="120"/>
         <w:jc w:val="left"/>
       </w:pPr>
-      <w:bookmarkStart w:id="19" w:name="_Toc244339762"/>
+      <w:bookmarkStart w:id="19" w:name="_Toc244342754"/>
       <w:r>
         <w:rPr>
           <w:rFonts w:eastAsia="Times New Roman" w:cs="Times New Roman"/>
@@ -10776,7 +10783,7 @@
         <w:spacing w:before="160" w:after="80"/>
         <w:jc w:val="left"/>
       </w:pPr>
-      <w:bookmarkStart w:id="20" w:name="_Toc244339763"/>
+      <w:bookmarkStart w:id="20" w:name="_Toc244342755"/>
       <w:r>
         <w:rPr>
           <w:rFonts w:eastAsia="Times New Roman" w:cs="Times New Roman"/>
@@ -10876,7 +10883,7 @@
         <w:spacing w:before="160" w:after="80"/>
         <w:jc w:val="left"/>
       </w:pPr>
-      <w:bookmarkStart w:id="21" w:name="_Toc244339764"/>
+      <w:bookmarkStart w:id="21" w:name="_Toc244342756"/>
       <w:r>
         <w:rPr>
           <w:rFonts w:eastAsia="Times New Roman" w:cs="Times New Roman"/>
@@ -10917,7 +10924,7 @@
           <w:rFonts w:eastAsia="Times New Roman"/>
           <w:szCs w:val="26"/>
         </w:rPr>
-        <w:t>Firmware giữ đúng thang đo ±4g mà mô hình TinyML MLP đã dùng khi huấn luyện, với hệ số độ nhạy 8192 LSB/g và độ phân giải khoảng 0,12 mg/LSB, đủ mịn để nhận biết các dao động nhỏ trong bộ giám sát bất động. Ngưỡng mở ứng viên va đập 2,0g nằm ở giữa thang đo; với những cú va chạm rất mạnh, giá trị từng trục có thể bão hòa ở ±4g, nhưng máy trạng thái chỉ cần |a| ≥ 2,0g để mở ứng viên nên quyết định phát hiện ngã không bị ảnh hưởng.</w:t>
+        <w:t>Firmware giữ đúng thang đo ±4g mà mô hình TinyML MLP đã dùng khi huấn luyện, với hệ số độ nhạy 8192 LSB/g và độ phân giải khoảng 0,12 mg/LSB, đủ mịn để nhận biết các dao động nhỏ trong bộ giám sát bất động. Ngưỡng va đập 2,0g để phát hiện nghi ngã (fall candidate) nằm ở giữa thang đo; với những cú va chạm rất mạnh, giá trị từng trục có thể bão hòa ở ±4g, nhưng máy trạng thái chỉ cần |a| ≥ 2,0g để phát hiện nghi ngã, bắt đầu pha xác minh nên quyết định phát hiện ngã không bị ảnh hưởng.</w:t>
       </w:r>
     </w:p>
     <w:p>
@@ -10938,7 +10945,15 @@
           <w:rFonts w:eastAsia="Times New Roman"/>
           <w:szCs w:val="26"/>
         </w:rPr>
-        <w:t>Cung cấp hệ số độ nhạy 65,5 LSB/(°/s), đủ rộng để đo chính xác tốc độ xoay thân người khi mất thăng bằng (thường vượt ngưỡng 120 °/s đến 350 °/s) mà không bị tràn số.</w:t>
+        <w:t xml:space="preserve">Cung cấp hệ số độ nhạy 65,5 LSB/(°/s), đủ rộng để đo chính xác tốc độ xoay thân </w:t>
+      </w:r>
+      <w:r>
+        <w:rPr>
+          <w:rFonts w:eastAsia="Times New Roman"/>
+          <w:szCs w:val="26"/>
+        </w:rPr>
+        <w:lastRenderedPageBreak/>
+        <w:t>người khi mất thăng bằng (thường vượt ngưỡng 120 °/s đến 350 °/s) mà không bị tràn số.</w:t>
       </w:r>
     </w:p>
     <w:p>
@@ -10952,7 +10967,6 @@
           <w:b/>
           <w:szCs w:val="26"/>
         </w:rPr>
-        <w:lastRenderedPageBreak/>
         <w:t xml:space="preserve">• Bộ lọc thông thấp số nội tại (DLPF = 4, băng thông ~21 Hz) và bộ chia tần số 50 Hz: </w:t>
       </w:r>
       <w:r>
@@ -10969,7 +10983,7 @@
         <w:spacing w:before="160" w:after="80"/>
         <w:jc w:val="left"/>
       </w:pPr>
-      <w:bookmarkStart w:id="22" w:name="_Toc244339765"/>
+      <w:bookmarkStart w:id="22" w:name="_Toc244342757"/>
       <w:r>
         <w:rPr>
           <w:rFonts w:eastAsia="Times New Roman" w:cs="Times New Roman"/>
@@ -10998,7 +11012,7 @@
         <w:spacing w:before="160" w:after="80"/>
         <w:jc w:val="left"/>
       </w:pPr>
-      <w:bookmarkStart w:id="23" w:name="_Toc244339766"/>
+      <w:bookmarkStart w:id="23" w:name="_Toc244342758"/>
       <w:r>
         <w:rPr>
           <w:rFonts w:eastAsia="Times New Roman" w:cs="Times New Roman"/>
@@ -11031,6 +11045,7 @@
         <w:rPr>
           <w:rFonts w:eastAsia="Times New Roman"/>
         </w:rPr>
+        <w:lastRenderedPageBreak/>
         <w:t>Bảng 2.1. Danh mục linh kiện phần cứng (BOM) của mạch thiết bị đeo PCB Rev 1.1</w:t>
       </w:r>
     </w:p>
@@ -11252,7 +11267,6 @@
                 <w:sz w:val="21"/>
                 <w:szCs w:val="21"/>
               </w:rPr>
-              <w:lastRenderedPageBreak/>
               <w:t>1</w:t>
             </w:r>
           </w:p>
@@ -13772,7 +13786,7 @@
         <w:spacing w:before="200" w:after="120"/>
         <w:jc w:val="left"/>
       </w:pPr>
-      <w:bookmarkStart w:id="24" w:name="_Toc244339767"/>
+      <w:bookmarkStart w:id="24" w:name="_Toc244342759"/>
       <w:r>
         <w:rPr>
           <w:rFonts w:eastAsia="Times New Roman" w:cs="Times New Roman"/>
@@ -13788,7 +13802,7 @@
         <w:spacing w:before="160" w:after="80"/>
         <w:jc w:val="left"/>
       </w:pPr>
-      <w:bookmarkStart w:id="25" w:name="_Toc244339768"/>
+      <w:bookmarkStart w:id="25" w:name="_Toc244342760"/>
       <w:r>
         <w:rPr>
           <w:rFonts w:eastAsia="Times New Roman" w:cs="Times New Roman"/>
@@ -14906,7 +14920,7 @@
         <w:spacing w:before="160" w:after="80"/>
         <w:jc w:val="left"/>
       </w:pPr>
-      <w:bookmarkStart w:id="26" w:name="_Toc244339769"/>
+      <w:bookmarkStart w:id="26" w:name="_Toc244342761"/>
       <w:r>
         <w:rPr>
           <w:rFonts w:eastAsia="Times New Roman" w:cs="Times New Roman"/>
@@ -15115,7 +15129,7 @@
         <w:spacing w:before="160" w:after="80"/>
         <w:jc w:val="left"/>
       </w:pPr>
-      <w:bookmarkStart w:id="27" w:name="_Toc244339770"/>
+      <w:bookmarkStart w:id="27" w:name="_Toc244342762"/>
       <w:r>
         <w:rPr>
           <w:rFonts w:eastAsia="Times New Roman" w:cs="Times New Roman"/>
@@ -15665,7 +15679,7 @@
         <w:spacing w:before="200" w:after="120"/>
         <w:jc w:val="left"/>
       </w:pPr>
-      <w:bookmarkStart w:id="28" w:name="_Toc244339771"/>
+      <w:bookmarkStart w:id="28" w:name="_Toc244342763"/>
       <w:r>
         <w:rPr>
           <w:rFonts w:eastAsia="Times New Roman" w:cs="Times New Roman"/>
@@ -16558,7 +16572,7 @@
         <w:spacing w:before="200" w:after="120"/>
         <w:jc w:val="left"/>
       </w:pPr>
-      <w:bookmarkStart w:id="29" w:name="_Toc244339772"/>
+      <w:bookmarkStart w:id="29" w:name="_Toc244342764"/>
       <w:r>
         <w:rPr>
           <w:rFonts w:eastAsia="Times New Roman" w:cs="Times New Roman"/>
@@ -16719,7 +16733,7 @@
         <w:spacing w:before="120" w:after="240"/>
         <w:jc w:val="center"/>
       </w:pPr>
-      <w:bookmarkStart w:id="30" w:name="_Toc244339773"/>
+      <w:bookmarkStart w:id="30" w:name="_Toc244342765"/>
       <w:r>
         <w:rPr>
           <w:rFonts w:eastAsia="Times New Roman" w:cs="Times New Roman"/>
@@ -16736,7 +16750,7 @@
         <w:spacing w:before="200" w:after="120"/>
         <w:jc w:val="left"/>
       </w:pPr>
-      <w:bookmarkStart w:id="31" w:name="_Toc244339774"/>
+      <w:bookmarkStart w:id="31" w:name="_Toc244342766"/>
       <w:r>
         <w:rPr>
           <w:rFonts w:eastAsia="Times New Roman" w:cs="Times New Roman"/>
@@ -18117,7 +18131,7 @@
         <w:spacing w:before="200" w:after="120"/>
         <w:jc w:val="left"/>
       </w:pPr>
-      <w:bookmarkStart w:id="32" w:name="_Toc244339775"/>
+      <w:bookmarkStart w:id="32" w:name="_Toc244342767"/>
       <w:r>
         <w:rPr>
           <w:rFonts w:eastAsia="Times New Roman" w:cs="Times New Roman"/>
@@ -18252,7 +18266,7 @@
         <w:spacing w:before="200" w:after="120"/>
         <w:jc w:val="left"/>
       </w:pPr>
-      <w:bookmarkStart w:id="33" w:name="_Toc244339776"/>
+      <w:bookmarkStart w:id="33" w:name="_Toc244342768"/>
       <w:r>
         <w:rPr>
           <w:rFonts w:eastAsia="Times New Roman" w:cs="Times New Roman"/>
@@ -18268,7 +18282,7 @@
         <w:spacing w:before="160" w:after="80"/>
         <w:jc w:val="left"/>
       </w:pPr>
-      <w:bookmarkStart w:id="34" w:name="_Toc244339777"/>
+      <w:bookmarkStart w:id="34" w:name="_Toc244342769"/>
       <w:r>
         <w:rPr>
           <w:rFonts w:eastAsia="Times New Roman" w:cs="Times New Roman"/>
@@ -18360,14 +18374,14 @@
           <w:b/>
           <w:szCs w:val="26"/>
         </w:rPr>
-        <w:t xml:space="preserve">• Bước 1 - Mở ứng viên va chạm (Impact Trigger): </w:t>
+        <w:t xml:space="preserve">• Bước 1 - Phát hiện nghi ngã, bắt đầu pha xác minh (Impact Trigger): </w:t>
       </w:r>
       <w:r>
         <w:rPr>
           <w:rFonts w:eastAsia="Times New Roman"/>
           <w:szCs w:val="26"/>
         </w:rPr>
-        <w:t>Hệ thống liên tục duy trì một mẫu tham chiếu tư thế trước va chạm (before_, được cập nhật mỗi khi cơ thể ở trạng thái ổn định với ||a| - 1| &lt; 0,15g và |ω| &lt; 30 °/s). Ngay khi biên độ tổng gia tốc vượt ngưỡng IMPACT_G = 2,0g (a_mag = sqrt(ax² + ay² + az²) ≥ 2,0g), một ứng viên ngã (Candidate) được mở và ghi nhận biên độ đỉnh peakG.</w:t>
+        <w:t>Hệ thống liên tục duy trì một mẫu tham chiếu tư thế trước va chạm (before_, được cập nhật mỗi khi cơ thể ở trạng thái ổn định với ||a| - 1| &lt; 0,15g và |ω| &lt; 30 °/s). Ngay khi biên độ tổng gia tốc vượt ngưỡng IMPACT_G = 2,0g (a_mag = sqrt(ax² + ay² + az²) ≥ 2,0g), một sự kiện nghi ngã (fall candidate) được ghi nhận và ghi nhận biên độ đỉnh peakG.</w:t>
       </w:r>
     </w:p>
     <w:p>
@@ -18388,7 +18402,7 @@
           <w:rFonts w:eastAsia="Times New Roman"/>
           <w:szCs w:val="26"/>
         </w:rPr>
-        <w:t>Một cú gõ nhẹ vào vỏ hộp hoặc đặt thiết bị xuống bàn có thể tạo ra xung gia tốc &gt; 2,0g nhưng không phải là té ngã. Do đó, ứng viên chỉ hợp lệ khi có ít nhất 1 trong 3 bằng chứng động học độc lập: (a) Xuất hiện pha rơi tự do (Free-fall) với a_mag &lt; 0,6g trong vòng 1000 ms ngay trước va chạm; HOẶC (b) Vận tốc góc xoay thân người đạt đỉnh ≥ 120 °/s (ROTATION_DPS); HOẶC (c) Mạng nơ-ron TinyML MLP phân loại cửa sổ chuyển động thuộc lớp 'nga' (Label 1) với độ tin cậy ≥ 70% trong vòng 1500 ms sau thời điểm va chạm.</w:t>
+        <w:t>Một cú gõ nhẹ vào vỏ hộp hoặc đặt thiết bị xuống bàn có thể tạo ra xung gia tốc &gt; 2,0g nhưng không phải là té ngã. Do đó, sự kiện nghi ngã chỉ hợp lệ khi có ít nhất 1 trong 3 bằng chứng động học độc lập: (a) Xuất hiện pha rơi tự do (Free-fall) với a_mag &lt; 0,6g trong vòng 1000 ms ngay trước va chạm; HOẶC (b) Vận tốc góc xoay thân người đạt đỉnh ≥ 120 °/s (ROTATION_DPS); HOẶC (c) Mạng nơ-ron TinyML MLP phân loại cửa sổ chuyển động thuộc lớp 'nga' (Label 1) với độ tin cậy ≥ 70% trong vòng 1500 ms sau thời điểm va chạm.</w:t>
       </w:r>
     </w:p>
     <w:p>
@@ -18402,7 +18416,7 @@
           <w:b/>
           <w:szCs w:val="26"/>
         </w:rPr>
-        <w:t xml:space="preserve">• Bước 3 - Pha lắng dao động sau va chạm (Bounce/Settle Skipping - 1000 ms): </w:t>
+        <w:t xml:space="preserve">• Bước 3 - Pha ổn định (settling) sau va chạm (Bounce/Settle Skipping - 1000 ms): </w:t>
       </w:r>
       <w:r>
         <w:rPr>
@@ -18423,14 +18437,14 @@
           <w:b/>
           <w:szCs w:val="26"/>
         </w:rPr>
-        <w:t xml:space="preserve">• Bước 4 - Quan sát bất động sau ngã và kiểm tra góc lệch tư thế (Post-Fall Observation - 2000 ms): </w:t>
+        <w:t xml:space="preserve">• Bước 4 - Pha xác minh tư thế sau ngã và kiểm tra góc lệch tư thế (Post-Fall Observation - 2000 ms): </w:t>
       </w:r>
       <w:r>
         <w:rPr>
           <w:rFonts w:eastAsia="Times New Roman"/>
           <w:szCs w:val="26"/>
         </w:rPr>
-        <w:t xml:space="preserve">Trong cửa sổ 2000 ms tiếp theo (OBSERVE_MS = 2000 ms, tương ứng từ 1,0 s đến 3,0 s sau va chạm), hệ thống đếm tổng số mẫu </w:t>
+        <w:t xml:space="preserve">Trong cửa sổ 2000 ms tiếp theo (OBSERVE_MS = </w:t>
       </w:r>
       <w:r>
         <w:rPr>
@@ -18438,7 +18452,7 @@
           <w:szCs w:val="26"/>
         </w:rPr>
         <w:lastRenderedPageBreak/>
-        <w:t>tổng và số mẫu đứng yên (||a| - 1| &lt; 0,20g và |ω| &lt; 30 °/s), đồng thời tính trung bình vector hướng trọng lực sau va chạm a_after. Sự kiện té ngã chỉ được XÁC NHẬN (CONFIRMED) khi thỏa mãn đồng thời cả hai điều kiện quyết định: (1) Tỷ lệ mẫu đứng yên đạt từ 80% trở lên (loại bỏ hoàn toàn trường hợp người dùng đang chạy bộ hoặc nhảy dây liên tục); và (2) Góc lệch tư thế θ giữa vector trước va chạm before_ và sau va chạm a_after tính theo công thức (3.2) đạt từ 45° trở lên (loại bỏ trường hợp ngồi phịch xuống ghế nhưng thân trên vẫn thẳng đứng):</w:t>
+        <w:t>2000 ms, tương ứng từ 1,0 s đến 3,0 s sau va chạm), hệ thống đếm tổng số mẫu tổng và số mẫu đứng yên (||a| - 1| &lt; 0,20g và |ω| &lt; 30 °/s), đồng thời tính trung bình vector hướng trọng lực sau va chạm a_after. Sự kiện té ngã chỉ được XÁC NHẬN (CONFIRMED) khi thỏa mãn đồng thời cả hai điều kiện quyết định: (1) Tỷ lệ mẫu đứng yên đạt từ 80% trở lên (loại bỏ hoàn toàn trường hợp người dùng đang chạy bộ hoặc nhảy dây liên tục); và (2) Góc lệch tư thế θ giữa vector trước va chạm before_ và sau va chạm a_after tính theo công thức (3.2) đạt từ 45° trở lên (loại bỏ trường hợp ngồi phịch xuống ghế nhưng thân trên vẫn thẳng đứng):</w:t>
       </w:r>
     </w:p>
     <w:p>
@@ -18748,7 +18762,7 @@
                 <w:sz w:val="21"/>
                 <w:szCs w:val="21"/>
               </w:rPr>
-              <w:t>Ngưỡng biên độ tổng gia tốc kích hoạt ứng viên kiểm tra té ngã</w:t>
+              <w:t>Ngưỡng biên độ tổng gia tốc phát hiện nghi ngã, bắt đầu pha xác minh</w:t>
             </w:r>
           </w:p>
         </w:tc>
@@ -19098,7 +19112,7 @@
                 <w:sz w:val="21"/>
                 <w:szCs w:val="21"/>
               </w:rPr>
-              <w:t>Khoảng thời gian quan sát trạng thái nằm yên và đo tư thế sau pha lắng</w:t>
+              <w:t>Khoảng thời gian xác minh trạng thái nằm yên và đo tư thế sau pha ổn định</w:t>
             </w:r>
           </w:p>
         </w:tc>
@@ -19272,7 +19286,7 @@
                 <w:sz w:val="21"/>
                 <w:szCs w:val="21"/>
               </w:rPr>
-              <w:t>Tỷ lệ mẫu đứng yên tối thiểu trong cửa sổ quan sát 2 giây sau ngã</w:t>
+              <w:t>Tỷ lệ mẫu đứng yên tối thiểu trong pha xác minh tư thế 2 giây sau ngã</w:t>
             </w:r>
           </w:p>
         </w:tc>
@@ -19463,13 +19477,12 @@
         <w:spacing w:before="160" w:after="80"/>
         <w:jc w:val="left"/>
       </w:pPr>
-      <w:bookmarkStart w:id="35" w:name="_Toc244339778"/>
+      <w:bookmarkStart w:id="35" w:name="_Toc244342770"/>
       <w:r>
         <w:rPr>
           <w:rFonts w:eastAsia="Times New Roman" w:cs="Times New Roman"/>
           <w:szCs w:val="26"/>
         </w:rPr>
-        <w:lastRenderedPageBreak/>
         <w:t>3.3.2. Trích xuất 30 đặc trưng miền thời gian và suy luận mạng MLP (30 -&gt; 16 -&gt; 8 -&gt; 5)</w:t>
       </w:r>
       <w:bookmarkEnd w:id="35"/>
@@ -20127,7 +20140,7 @@
         <w:spacing w:before="160" w:after="80"/>
         <w:jc w:val="left"/>
       </w:pPr>
-      <w:bookmarkStart w:id="36" w:name="_Toc244339779"/>
+      <w:bookmarkStart w:id="36" w:name="_Toc244342771"/>
       <w:r>
         <w:rPr>
           <w:rFonts w:eastAsia="Times New Roman" w:cs="Times New Roman"/>
@@ -20206,7 +20219,7 @@
         <w:spacing w:before="200" w:after="120"/>
         <w:jc w:val="left"/>
       </w:pPr>
-      <w:bookmarkStart w:id="37" w:name="_Toc244339780"/>
+      <w:bookmarkStart w:id="37" w:name="_Toc244342772"/>
       <w:r>
         <w:rPr>
           <w:rFonts w:eastAsia="Times New Roman" w:cs="Times New Roman"/>
@@ -21110,7 +21123,7 @@
         <w:spacing w:before="200" w:after="120"/>
         <w:jc w:val="left"/>
       </w:pPr>
-      <w:bookmarkStart w:id="38" w:name="_Toc244339781"/>
+      <w:bookmarkStart w:id="38" w:name="_Toc244342773"/>
       <w:r>
         <w:rPr>
           <w:rFonts w:eastAsia="Times New Roman" w:cs="Times New Roman"/>
@@ -21274,7 +21287,7 @@
         <w:jc w:val="left"/>
       </w:pPr>
       <w:bookmarkStart w:id="39" w:name="_TocNew3_6"/>
-      <w:bookmarkStart w:id="40" w:name="_Toc244339782"/>
+      <w:bookmarkStart w:id="40" w:name="_Toc244342774"/>
       <w:r>
         <w:rPr>
           <w:rFonts w:eastAsia="Times New Roman" w:cs="Times New Roman"/>
@@ -21340,7 +21353,7 @@
         <w:tblLook w:val="04A0" w:firstRow="1" w:lastRow="0" w:firstColumn="1" w:lastColumn="0" w:noHBand="0" w:noVBand="1"/>
       </w:tblPr>
       <w:tblGrid>
-        <w:gridCol w:w="1187"/>
+        <w:gridCol w:w="1209"/>
         <w:gridCol w:w="2500"/>
         <w:gridCol w:w="1500"/>
         <w:gridCol w:w="1800"/>
@@ -21805,7 +21818,7 @@
                 <w:sz w:val="20"/>
                 <w:szCs w:val="20"/>
               </w:rPr>
-              <w:t>3. Pre-Warm TLS</w:t>
+              <w:t>3. Thiết lập kết nối trước (connection pre-warming)</w:t>
             </w:r>
           </w:p>
         </w:tc>
@@ -21974,7 +21987,7 @@
                 <w:sz w:val="20"/>
                 <w:szCs w:val="20"/>
               </w:rPr>
-              <w:t>Đánh thức tác vụ bằng task notification; PUT trạng thái alarm trên phiên TLS nóng rồi nhường TlsGate</w:t>
+              <w:t>Đánh thức tác vụ bằng task notification; PUT trạng thái alarm trên phiên TLS dựng sẵn (keep-alive) rồi nhường TlsGate</w:t>
             </w:r>
           </w:p>
         </w:tc>
@@ -22218,6 +22231,7 @@
           <w:rFonts w:eastAsia="Times New Roman"/>
           <w:szCs w:val="26"/>
         </w:rPr>
+        <w:lastRenderedPageBreak/>
         <w:t>Các giá trị độ trễ nêu trong mục này là giá trị thiết kế/mục tiêu; kết quả đo thực tế trên phần cứng sẽ được bổ sung trong phần kiểm thử tại mục 3.8.</w:t>
       </w:r>
     </w:p>
@@ -22228,13 +22242,12 @@
         <w:jc w:val="left"/>
       </w:pPr>
       <w:bookmarkStart w:id="41" w:name="_TocNew3_6_1"/>
-      <w:bookmarkStart w:id="42" w:name="_Toc244339783"/>
+      <w:bookmarkStart w:id="42" w:name="_Toc244342775"/>
       <w:r>
         <w:rPr>
           <w:rFonts w:eastAsia="Times New Roman" w:cs="Times New Roman"/>
           <w:szCs w:val="26"/>
         </w:rPr>
-        <w:lastRenderedPageBreak/>
         <w:t>3.6.1. Lớp 1 - Phát chùm gói tin khẩn cấp UDP trong mạng nội bộ (UDP LAN Emergency Burst)</w:t>
       </w:r>
       <w:bookmarkEnd w:id="41"/>
@@ -23283,7 +23296,7 @@
         <w:jc w:val="left"/>
       </w:pPr>
       <w:bookmarkStart w:id="43" w:name="_TocNew3_6_2"/>
-      <w:bookmarkStart w:id="44" w:name="_Toc244339784"/>
+      <w:bookmarkStart w:id="44" w:name="_Toc244342776"/>
       <w:r>
         <w:rPr>
           <w:rFonts w:eastAsia="Times New Roman" w:cs="Times New Roman"/>
@@ -24176,13 +24189,13 @@
         <w:jc w:val="left"/>
       </w:pPr>
       <w:bookmarkStart w:id="45" w:name="_TocNew3_6_3"/>
-      <w:bookmarkStart w:id="46" w:name="_Toc244339785"/>
+      <w:bookmarkStart w:id="46" w:name="_Toc244342777"/>
       <w:r>
         <w:rPr>
           <w:rFonts w:eastAsia="Times New Roman" w:cs="Times New Roman"/>
           <w:szCs w:val="26"/>
         </w:rPr>
-        <w:t>3.6.3. Lớp 3 - Khởi động trước phiên TLS ở pha va chạm (Pre-Warm TLS)</w:t>
+        <w:t>3.6.3. Lớp 3 - Thiết lập kết nối trước (Pre-warming)</w:t>
       </w:r>
       <w:bookmarkEnd w:id="45"/>
       <w:bookmarkEnd w:id="46"/>
@@ -24197,7 +24210,7 @@
           <w:rFonts w:eastAsia="Times New Roman"/>
           <w:szCs w:val="26"/>
         </w:rPr>
-        <w:t>Theo máy trạng thái FallDetector (mục 3.3.1), sau khi phát hiện va đập có độ lớn từ 2,0 g trở lên, thiết bị mở một ứng viên ngã và cần khoảng 3 giây (1 giây ổn định và 2 giây quan sát trạng thái nằm yên) trước khi xác nhận. Lớp 3 tận dụng chính khoảng thời gian này để chuẩn bị sẵn đường truyền mạng, sao cho khi ngã được xác nhận, cảnh báo có thể được gửi đi ngay mà không phải chờ thiết lập kết nối. Ngay tại pha va chạm, firmware thực hiện:</w:t>
+        <w:t>Theo máy trạng thái FallDetector (mục 3.3.1), sau khi phát hiện va đập có độ lớn từ 2,0 g trở lên, thiết bị phát hiện nghi ngã, bắt đầu pha xác minh và cần khoảng 3 giây (1 giây pha ổn định và 2 giây pha xác minh tư thế nằm yên) trước khi xác nhận. Lớp 3 tận dụng chính khoảng thời gian này để chuẩn bị sẵn đường truyền mạng, sao cho khi ngã được xác nhận, cảnh báo có thể được gửi đi ngay mà không phải chờ thiết lập kết nối. Ngay tại pha va chạm, firmware thực hiện:</w:t>
       </w:r>
     </w:p>
     <w:p>
@@ -24252,7 +24265,7 @@
           <w:rFonts w:eastAsia="Times New Roman"/>
           <w:szCs w:val="26"/>
         </w:rPr>
-        <w:t>Cơ chế này không làm tăng tỷ lệ báo giả: nếu ứng viên ngã bị hủy (thiếu bằng chứng, hoặc người đeo không nằm yên với tư thế lệch ≥ 45° trong pha quan sát), hệ thống không phát bất kỳ cảnh báo nào. Chi phí duy nhất là điện năng tiêu thụ của Wi-Fi tăng thêm trong tối đa 10 giây.</w:t>
+        <w:t>Cơ chế này không làm tăng tỷ lệ báo giả: nếu sự kiện nghi ngã bị loại bỏ (Verdict::Rejected: thiếu bằng chứng, hoặc người đeo không nằm yên với tư thế lệch ≥ 45° trong pha xác minh tư thế), hệ thống không phát bất kỳ cảnh báo nào. Chi phí duy nhất là điện năng tiêu thụ của Wi-Fi tăng thêm trong tối đa 10 giây.</w:t>
       </w:r>
     </w:p>
     <w:p>
@@ -24262,7 +24275,7 @@
         <w:jc w:val="left"/>
       </w:pPr>
       <w:bookmarkStart w:id="47" w:name="_TocNew3_6_4"/>
-      <w:bookmarkStart w:id="48" w:name="_Toc244339786"/>
+      <w:bookmarkStart w:id="48" w:name="_Toc244342778"/>
       <w:r>
         <w:rPr>
           <w:rFonts w:eastAsia="Times New Roman" w:cs="Times New Roman"/>
@@ -24283,7 +24296,7 @@
           <w:rFonts w:eastAsia="Times New Roman"/>
           <w:szCs w:val="26"/>
         </w:rPr>
-        <w:t>Lớp 4 loại bỏ các khoảng chờ cố định giữa các tác vụ trên đường xử lý khẩn cấp (Zero-Wait) và tận dụng phiên TLS đã được làm nóng ở Lớp 3 để đưa trạng thái báo động lên đám mây trước tiên (Fast-Flush). Khi ngã hoặc bất động được xác nhận, chuỗi thao tác diễn ra như sau:</w:t>
+        <w:t>Lớp 4 loại bỏ các khoảng chờ cố định giữa các tác vụ trên đường xử lý khẩn cấp (Zero-Wait) và tận dụng phiên TLS dựng sẵn ở Lớp 3 để đưa trạng thái báo động lên đám mây trước tiên (Fast-Flush). Khi ngã hoặc bất động được xác nhận, chuỗi thao tác diễn ra như sau:</w:t>
       </w:r>
     </w:p>
     <w:p>
@@ -24394,7 +24407,7 @@
           <w:rFonts w:eastAsia="Times New Roman"/>
           <w:szCs w:val="26"/>
         </w:rPr>
-        <w:t>Cơ chế Fast-Flush hoạt động khi Notifier bật cờ alertWaiting trong lúc CloudSync đang giữ một phiên TLS nóng đã xác thực - điều kiện mà Lớp 3 chủ động tạo ra từ pha va chạm. Khi đó, CloudSync gửi ngay một yêu cầu PUT trạng thái alarm lên Firebase trên chính phiên TLS này (thời gian chờ tối đa rút xuống 1,5 s, mục tiêu thiết kế khoảng 150 ms), rồi lập tức gọi releaseTls() để nhường cổng TlsGate cho Notifier gửi Telegram trước, Gmail SMTP sau. Bất biến của TlsGate được giữ nguyên: tại mọi thời điểm chỉ tồn tại tối đa một phiên TLS (khoảng 46 KB RAM).</w:t>
+        <w:t>Cơ chế Fast-Flush hoạt động khi Notifier bật cờ alertWaiting trong lúc CloudSync đang giữ một phiên TLS dựng sẵn đã xác thực - điều kiện mà Lớp 3 chủ động tạo ra từ pha va chạm. Khi đó, CloudSync gửi ngay một yêu cầu PUT trạng thái alarm lên Firebase trên chính phiên TLS này (thời gian chờ tối đa rút xuống 1,5 s, mục tiêu thiết kế khoảng 150 ms), rồi lập tức gọi releaseTls() để nhường cổng TlsGate cho Notifier gửi Telegram trước, Gmail SMTP sau. Bất biến của TlsGate được giữ nguyên: tại mọi thời điểm chỉ tồn tại tối đa một phiên TLS (khoảng 46 KB RAM).</w:t>
       </w:r>
     </w:p>
     <w:p>
@@ -24611,7 +24624,7 @@
                 <w:sz w:val="20"/>
                 <w:szCs w:val="20"/>
               </w:rPr>
-              <w:t>Va đập ≥ 2,0 g mở ứng viên ngã; notifier.boost(10 s) tắt Modem Sleep; cloud.prewarm() giữ sẵn phiên TLS Firebase (Lớp 3)</w:t>
+              <w:t>Va đập ≥ 2,0 g: phát hiện nghi ngã, bắt đầu pha xác minh; notifier.boost(10 s) tắt Modem Sleep; cloud.prewarm() giữ sẵn phiên TLS Firebase (Lớp 3)</w:t>
             </w:r>
           </w:p>
         </w:tc>
@@ -25186,7 +25199,7 @@
                 <w:sz w:val="20"/>
                 <w:szCs w:val="20"/>
               </w:rPr>
-              <w:t>Fast-Flush: PUT trạng thái alarm trên phiên TLS nóng (timeout 1,5 s), sau đó releaseTls()</w:t>
+              <w:t>Fast-Flush: PUT trạng thái alarm trên phiên TLS dựng sẵn (timeout 1,5 s), sau đó releaseTls()</w:t>
             </w:r>
           </w:p>
         </w:tc>
@@ -25488,7 +25501,7 @@
         <w:jc w:val="left"/>
       </w:pPr>
       <w:bookmarkStart w:id="49" w:name="_TocNew3_6_5"/>
-      <w:bookmarkStart w:id="50" w:name="_Toc244339787"/>
+      <w:bookmarkStart w:id="50" w:name="_Toc244342779"/>
       <w:r>
         <w:rPr>
           <w:rFonts w:eastAsia="Times New Roman" w:cs="Times New Roman"/>
@@ -26117,7 +26130,7 @@
         <w:jc w:val="left"/>
       </w:pPr>
       <w:bookmarkStart w:id="51" w:name="_TocNew3_7"/>
-      <w:bookmarkStart w:id="52" w:name="_Toc244339788"/>
+      <w:bookmarkStart w:id="52" w:name="_Toc244342780"/>
       <w:r>
         <w:rPr>
           <w:rFonts w:eastAsia="Times New Roman" w:cs="Times New Roman"/>
@@ -26148,7 +26161,7 @@
         <w:jc w:val="left"/>
       </w:pPr>
       <w:bookmarkStart w:id="53" w:name="_TocNew3_7_1"/>
-      <w:bookmarkStart w:id="54" w:name="_Toc244339789"/>
+      <w:bookmarkStart w:id="54" w:name="_Toc244342781"/>
       <w:r>
         <w:rPr>
           <w:rFonts w:eastAsia="Times New Roman" w:cs="Times New Roman"/>
@@ -26284,7 +26297,7 @@
         <w:jc w:val="left"/>
       </w:pPr>
       <w:bookmarkStart w:id="55" w:name="_TocNew3_7_2"/>
-      <w:bookmarkStart w:id="56" w:name="_Toc244339790"/>
+      <w:bookmarkStart w:id="56" w:name="_Toc244342782"/>
       <w:r>
         <w:rPr>
           <w:rFonts w:eastAsia="Times New Roman" w:cs="Times New Roman"/>
@@ -26413,7 +26426,7 @@
         <w:jc w:val="left"/>
       </w:pPr>
       <w:bookmarkStart w:id="57" w:name="_TocNew3_7_3"/>
-      <w:bookmarkStart w:id="58" w:name="_Toc244339791"/>
+      <w:bookmarkStart w:id="58" w:name="_Toc244342783"/>
       <w:r>
         <w:rPr>
           <w:rFonts w:eastAsia="Times New Roman" w:cs="Times New Roman"/>
@@ -26537,7 +26550,7 @@
         <w:jc w:val="left"/>
       </w:pPr>
       <w:bookmarkStart w:id="59" w:name="_TocNew3_7_4"/>
-      <w:bookmarkStart w:id="60" w:name="_Toc244339792"/>
+      <w:bookmarkStart w:id="60" w:name="_Toc244342784"/>
       <w:r>
         <w:rPr>
           <w:rFonts w:eastAsia="Times New Roman" w:cs="Times New Roman"/>
@@ -27231,7 +27244,7 @@
         <w:jc w:val="left"/>
       </w:pPr>
       <w:bookmarkStart w:id="61" w:name="_TocNew3_7_5"/>
-      <w:bookmarkStart w:id="62" w:name="_Toc244339793"/>
+      <w:bookmarkStart w:id="62" w:name="_Toc244342785"/>
       <w:r>
         <w:rPr>
           <w:rFonts w:eastAsia="Times New Roman" w:cs="Times New Roman"/>
@@ -27384,7 +27397,7 @@
         <w:spacing w:before="200" w:after="120"/>
         <w:jc w:val="left"/>
       </w:pPr>
-      <w:bookmarkStart w:id="63" w:name="_Toc244339794"/>
+      <w:bookmarkStart w:id="63" w:name="_Toc244342786"/>
       <w:r>
         <w:rPr>
           <w:rFonts w:eastAsia="Times New Roman" w:cs="Times New Roman"/>
@@ -27400,7 +27413,7 @@
         <w:spacing w:before="160" w:after="80"/>
         <w:jc w:val="left"/>
       </w:pPr>
-      <w:bookmarkStart w:id="64" w:name="_Toc244339795"/>
+      <w:bookmarkStart w:id="64" w:name="_Toc244342787"/>
       <w:r>
         <w:rPr>
           <w:rFonts w:eastAsia="Times New Roman" w:cs="Times New Roman"/>
@@ -27420,7 +27433,7 @@
           <w:rFonts w:eastAsia="Times New Roman"/>
           <w:szCs w:val="26"/>
         </w:rPr>
-        <w:t>Hình 3.6 trình bày kết quả ghi nhận và phân tích dạng sóng thực tế của biên độ tổng gia tốc |a| (g), vận tốc góc tổng hợp |ω| (°/s) và góc lệch tư thế θ (°) qua 5 giai đoạn điển hình của một sự kiện té ngã: (1) Giai đoạn đi bộ bình thường (0 - 1,8 s) với gia tốc dao động nhẹ quanh 1,0g và góc lệch tư thế &lt; 12°; (2) Pha rơi tự do ngắn (1,8 - 2,1 s) khi cơ thể mất điểm tựa làm |a| sụt xuống dưới ngưỡng 0,6g (đạt ~0,28g); (3) Pha va chạm mạnh xuống sàn (2,1 - 2,4 s) tạo đỉnh xung gia tốc đạt 3,45g (&gt; ngưỡng 2,0g) đồng thời vận tốc góc vọt lên 245 °/s (&gt; ngưỡng 120 °/s) và mạng TinyML MLP kích hoạt nhãn 'nga'; (4) Pha lắng dao động cơ học (2,4 - 3,4 s, SETTLE_MS = 1000 ms); và (5) Pha quan sát bất động sau ngã (3,4 - 5,4 s, OBSERVE_MS = 2000 ms) khi |a| ổn định trở lại ở 1,0g (tỷ lệ mẫu tĩnh đạt &gt; 92% ≥ 80%) nhưng góc lệch tư thế θ duy trì ở mức ~78° (≥ 45°), kích hoạt chính xác trạng thái CONFIRMED tại mốc t = 5,4 s.</w:t>
+        <w:t>Hình 3.6 trình bày kết quả ghi nhận và phân tích dạng sóng thực tế của biên độ tổng gia tốc |a| (g), vận tốc góc tổng hợp |ω| (°/s) và góc lệch tư thế θ (°) qua 5 giai đoạn điển hình của một sự kiện té ngã: (1) Giai đoạn đi bộ bình thường (0 - 1,8 s) với gia tốc dao động nhẹ quanh 1,0g và góc lệch tư thế &lt; 12°; (2) Pha rơi tự do ngắn (1,8 - 2,1 s) khi cơ thể mất điểm tựa làm |a| sụt xuống dưới ngưỡng 0,6g (đạt ~0,28g); (3) Pha va chạm mạnh xuống sàn (2,1 - 2,4 s) tạo đỉnh xung gia tốc đạt 3,45g (&gt; ngưỡng 2,0g) đồng thời vận tốc góc vọt lên 245 °/s (&gt; ngưỡng 120 °/s) và mạng TinyML MLP kích hoạt nhãn 'nga'; (4) Pha ổn định dao động cơ học (2,4 - 3,4 s, SETTLE_MS = 1000 ms); và (5) Pha xác minh tư thế sau ngã (3,4 - 5,4 s, OBSERVE_MS = 2000 ms) khi |a| ổn định trở lại ở 1,0g (tỷ lệ mẫu tĩnh đạt &gt; 92% ≥ 80%) nhưng góc lệch tư thế θ duy trì ở mức ~78° (≥ 45°), kích hoạt chính xác trạng thái CONFIRMED tại mốc t = 5,4 s.</w:t>
       </w:r>
     </w:p>
     <w:p>
@@ -27433,6 +27446,7 @@
         <w:rPr>
           <w:noProof/>
         </w:rPr>
+        <w:lastRenderedPageBreak/>
         <w:drawing>
           <wp:inline distT="0" distB="0" distL="0" distR="0" wp14:anchorId="2FAA7DBE" wp14:editId="3AA6B8CB">
             <wp:extent cx="5544000" cy="3328396"/>
@@ -27486,13 +27500,12 @@
         <w:spacing w:before="160" w:after="80"/>
         <w:jc w:val="left"/>
       </w:pPr>
-      <w:bookmarkStart w:id="65" w:name="_Toc244339796"/>
+      <w:bookmarkStart w:id="65" w:name="_Toc244342788"/>
       <w:r>
         <w:rPr>
           <w:rFonts w:eastAsia="Times New Roman" w:cs="Times New Roman"/>
           <w:szCs w:val="26"/>
         </w:rPr>
-        <w:lastRenderedPageBreak/>
         <w:t>3.8.2. Kết quả biên dịch tài nguyên bộ nhớ và kiểm thử đơn vị (Host Unit Tests)</w:t>
       </w:r>
       <w:bookmarkEnd w:id="65"/>
@@ -27533,6 +27546,7 @@
         <w:rPr>
           <w:rFonts w:eastAsia="Times New Roman"/>
         </w:rPr>
+        <w:lastRenderedPageBreak/>
         <w:t>Bảng 3.11. Thống kê tài nguyên bộ nhớ Flash, SRAM và PSRAM trên thiết bị đeo ESP32-S3 SuperMini và cầu nối Camera ESP32-S3 N16R8</w:t>
       </w:r>
     </w:p>
@@ -28151,7 +28165,6 @@
                 <w:sz w:val="21"/>
                 <w:szCs w:val="21"/>
               </w:rPr>
-              <w:lastRenderedPageBreak/>
               <w:t>Cầu nối Camera ESP32-S3 N16R8: RAM tĩnh (Global/BSS)</w:t>
             </w:r>
           </w:p>
@@ -28495,6 +28508,7 @@
         <w:rPr>
           <w:rFonts w:eastAsia="Times New Roman"/>
         </w:rPr>
+        <w:lastRenderedPageBreak/>
         <w:t>Bảng 3.12. Kết quả thực thi bộ kiểm thử tự động C++17 trên máy chủ (Host Unit Tests với Zig 0.13.0)</w:t>
       </w:r>
     </w:p>
@@ -29063,7 +29077,6 @@
                 <w:sz w:val="21"/>
                 <w:szCs w:val="21"/>
               </w:rPr>
-              <w:lastRenderedPageBreak/>
               <w:t>cloud_test.cpp</w:t>
             </w:r>
           </w:p>
@@ -29222,7 +29235,7 @@
         <w:spacing w:before="160" w:after="80"/>
         <w:jc w:val="left"/>
       </w:pPr>
-      <w:bookmarkStart w:id="66" w:name="_Toc244339797"/>
+      <w:bookmarkStart w:id="66" w:name="_Toc244342789"/>
       <w:r>
         <w:rPr>
           <w:rFonts w:eastAsia="Times New Roman" w:cs="Times New Roman"/>
@@ -29533,6 +29546,7 @@
                 <w:sz w:val="20"/>
                 <w:szCs w:val="20"/>
               </w:rPr>
+              <w:lastRenderedPageBreak/>
               <w:t>T02</w:t>
             </w:r>
           </w:p>
@@ -29587,7 +29601,7 @@
                 <w:sz w:val="20"/>
                 <w:szCs w:val="20"/>
               </w:rPr>
-              <w:t>Xác nhận té ngã sau đúng 3,0s (1s lắng + 2s quan sát); còi và LED bật tức thì</w:t>
+              <w:t>Xác nhận té ngã sau đúng 3,0s (1s ổn định + 2s xác minh); còi và LED bật tức thì</w:t>
             </w:r>
           </w:p>
         </w:tc>
@@ -29702,7 +29716,7 @@
                 <w:sz w:val="20"/>
                 <w:szCs w:val="20"/>
               </w:rPr>
-              <w:t>Ứng viên ngã bị hủy tại Bước 4 do tỷ lệ đứng yên &lt; 80% hoặc góc lệch &lt; 45°</w:t>
+              <w:t>Sự kiện nghi ngã bị loại bỏ tại Bước 4 do tỷ lệ đứng yên &lt; 80% hoặc góc lệch &lt; 45°</w:t>
             </w:r>
           </w:p>
         </w:tc>
@@ -29729,7 +29743,7 @@
                 <w:sz w:val="20"/>
                 <w:szCs w:val="20"/>
               </w:rPr>
-              <w:t>ĐẠT - Máy trạng thái tự hủy ứng viên (Reset về IDLE), hoàn toàn không báo giả</w:t>
+              <w:t>ĐẠT - Máy trạng thái tự loại bỏ sự kiện nghi ngã (Verdict::Rejected), hoàn toàn không báo giả</w:t>
             </w:r>
           </w:p>
         </w:tc>
@@ -30108,7 +30122,6 @@
                 <w:sz w:val="20"/>
                 <w:szCs w:val="20"/>
               </w:rPr>
-              <w:lastRenderedPageBreak/>
               <w:t>T07</w:t>
             </w:r>
           </w:p>
@@ -30783,12 +30796,13 @@
         <w:jc w:val="left"/>
       </w:pPr>
       <w:bookmarkStart w:id="67" w:name="_TocNew3_8_4"/>
-      <w:bookmarkStart w:id="68" w:name="_Toc244339798"/>
+      <w:bookmarkStart w:id="68" w:name="_Toc244342790"/>
       <w:r>
         <w:rPr>
           <w:rFonts w:eastAsia="Times New Roman" w:cs="Times New Roman"/>
           <w:szCs w:val="26"/>
         </w:rPr>
+        <w:lastRenderedPageBreak/>
         <w:t>3.8.4. Kiểm thử ứng dụng di động và đường truyền cảnh báo độ trễ thấp</w:t>
       </w:r>
       <w:bookmarkEnd w:id="67"/>
@@ -31215,7 +31229,6 @@
                 <w:sz w:val="20"/>
                 <w:szCs w:val="20"/>
               </w:rPr>
-              <w:lastRenderedPageBreak/>
               <w:t>AlertFusionEngine</w:t>
             </w:r>
           </w:p>
@@ -31832,7 +31845,15 @@
           <w:rFonts w:eastAsia="Times New Roman"/>
           <w:szCs w:val="26"/>
         </w:rPr>
-        <w:t>Độ trễ thực tế của từng kênh cảnh báo chưa được đo do hệ thống chưa được chạy trên điện thoại và phần cứng thật. Bảng 3.15 tổng hợp giá trị thiết kế/mục tiêu của từng kênh; cột kết quả đo sẽ được bổ sung. Thẻ Nhật ký sự kiện của ứng dụng ghi lại thời điểm tới của từng kênh cho mỗi sự cố, nên sẽ được sử dụng làm công cụ đo.</w:t>
+        <w:t xml:space="preserve">Độ trễ thực tế của từng kênh cảnh báo chưa được đo do hệ thống chưa được chạy trên điện thoại và phần cứng thật. Bảng 3.15 tổng hợp giá trị thiết kế/mục tiêu </w:t>
+      </w:r>
+      <w:r>
+        <w:rPr>
+          <w:rFonts w:eastAsia="Times New Roman"/>
+          <w:szCs w:val="26"/>
+        </w:rPr>
+        <w:lastRenderedPageBreak/>
+        <w:t>của từng kênh; cột kết quả đo sẽ được bổ sung. Thẻ Nhật ký sự kiện của ứng dụng ghi lại thời điểm tới của từng kênh cho mỗi sự cố, nên sẽ được sử dụng làm công cụ đo.</w:t>
       </w:r>
     </w:p>
     <w:p>
@@ -32353,7 +32374,6 @@
                 <w:sz w:val="20"/>
                 <w:szCs w:val="20"/>
               </w:rPr>
-              <w:lastRenderedPageBreak/>
               <w:t>Web Portal (LAN)</w:t>
             </w:r>
           </w:p>
@@ -32682,7 +32702,7 @@
         <w:spacing w:before="200" w:after="120"/>
         <w:jc w:val="left"/>
       </w:pPr>
-      <w:bookmarkStart w:id="69" w:name="_Toc244339799"/>
+      <w:bookmarkStart w:id="69" w:name="_Toc244342791"/>
       <w:r>
         <w:rPr>
           <w:rFonts w:eastAsia="Times New Roman" w:cs="Times New Roman"/>
@@ -32723,7 +32743,15 @@
           <w:rFonts w:eastAsia="Times New Roman"/>
           <w:szCs w:val="26"/>
         </w:rPr>
-        <w:t>(1) Thiết kế hoàn chỉnh từ sơ đồ nguyên lý đến mạch in PCB 2 lớp nhỏ gọn (60 × 50 mm, DRC/ERC = 0 lỗi) tích hợp quản lý nguồn pin Li-Po và chế độ ngủ sâu; (2) Thuật toán hợp nhất 4 bước kết hợp hiệu chuẩn 3D Rodrigues, điều kiện vật lý và mạng nơ-ron TinyML MLP cùng bộ giám sát bất động giúp triệt tiêu báo giả trong sinh hoạt hàng ngày; (3) Giải quyết thành công bài toán cạn kiệt bộ nhớ TLS trên vi điều khiển nhờ cơ chế PSRAM tlsCalloc và khóa nguyên tử TlsGate; (4) Kết hợp đa phương thức với nhánh Camera AI CanMV K230 và hệ sinh thái quản trị toàn diện (Web cục bộ baonga.local, Firebase Cloud Dashboard, Telegram, Gmail, BLE 5.0); (5) Đường truyền cảnh báo độ trễ thấp 5 lớp (UDP nội mạng, BLE không chặn, Pre-Warm TLS, Fast-Flush Firebase) cùng ứng dụng di động Android/iOS hợp nhất cảnh báo đa nguồn, được kiểm chứng bằng 69 kiểm thử tự động.</w:t>
+        <w:t xml:space="preserve">(1) Thiết kế hoàn chỉnh từ sơ đồ nguyên lý đến mạch in PCB 2 lớp nhỏ gọn (60 × 50 mm, DRC/ERC = 0 lỗi) tích hợp quản lý nguồn pin Li-Po và chế độ ngủ sâu; (2) Thuật toán hợp nhất 4 bước kết hợp hiệu chuẩn 3D Rodrigues, điều kiện vật lý và mạng nơ-ron TinyML MLP cùng bộ giám sát bất động giúp triệt tiêu báo giả trong sinh hoạt hàng ngày; (3) Giải quyết thành công bài toán cạn kiệt bộ nhớ TLS trên vi điều khiển nhờ cơ chế PSRAM tlsCalloc và khóa nguyên tử TlsGate; (4) Kết hợp đa phương thức với nhánh Camera AI CanMV K230 và hệ sinh thái quản trị toàn diện (Web cục bộ baonga.local, Firebase Cloud Dashboard, Telegram, Gmail, BLE 5.0); (5) Đường truyền cảnh báo độ trễ thấp 5 lớp (UDP nội mạng, BLE không chặn, thiết lập kết nối trước, </w:t>
+      </w:r>
+      <w:r>
+        <w:rPr>
+          <w:rFonts w:eastAsia="Times New Roman"/>
+          <w:szCs w:val="26"/>
+        </w:rPr>
+        <w:lastRenderedPageBreak/>
+        <w:t>Fast-Flush Firebase) cùng ứng dụng di động Android/iOS hợp nhất cảnh báo đa nguồn, được kiểm chứng bằng 69 kiểm thử tự động.</w:t>
       </w:r>
     </w:p>
     <w:p>
@@ -32744,15 +32772,7 @@
           <w:rFonts w:eastAsia="Times New Roman"/>
           <w:szCs w:val="26"/>
         </w:rPr>
-        <w:t xml:space="preserve">Mô hình mạng nơ-ron MLP hiện tại được huấn luyện trên tập dữ liệu chuẩn hóa quy mô vừa và kiểm thử trên các kịch bản giả lập có đệm bảo hộ; hệ thống vẫn phụ thuộc vào vùng phủ sóng Wi-Fi gia đình để đẩy thông báo ra Internet; độ trễ của các kênh cảnh báo mới được xác định ở mức giá trị thiết kế, chưa được đo trên phần cứng và điện thoại thật; trên iOS, ứng </w:t>
-      </w:r>
-      <w:r>
-        <w:rPr>
-          <w:rFonts w:eastAsia="Times New Roman"/>
-          <w:szCs w:val="26"/>
-        </w:rPr>
-        <w:lastRenderedPageBreak/>
-        <w:t>dụng cài bằng Sideloadly bị hệ điều hành tạm dừng khi chạy nền nếu không có kết nối BLE.</w:t>
+        <w:t>Mô hình mạng nơ-ron MLP hiện tại được huấn luyện trên tập dữ liệu chuẩn hóa quy mô vừa và kiểm thử trên các kịch bản giả lập có đệm bảo hộ; hệ thống vẫn phụ thuộc vào vùng phủ sóng Wi-Fi gia đình để đẩy thông báo ra Internet; độ trễ của các kênh cảnh báo mới được xác định ở mức giá trị thiết kế, chưa được đo trên phần cứng và điện thoại thật; trên iOS, ứng dụng cài bằng Sideloadly bị hệ điều hành tạm dừng khi chạy nền nếu không có kết nối BLE.</w:t>
       </w:r>
     </w:p>
     <w:p>
@@ -32787,7 +32807,7 @@
         <w:spacing w:before="120" w:after="240"/>
         <w:jc w:val="center"/>
       </w:pPr>
-      <w:bookmarkStart w:id="70" w:name="_Toc244339800"/>
+      <w:bookmarkStart w:id="70" w:name="_Toc244342792"/>
       <w:r>
         <w:rPr>
           <w:rFonts w:eastAsia="Times New Roman" w:cs="Times New Roman"/>
@@ -32949,7 +32969,7 @@
         <w:spacing w:before="120" w:after="240"/>
         <w:jc w:val="center"/>
       </w:pPr>
-      <w:bookmarkStart w:id="71" w:name="_Toc244339801"/>
+      <w:bookmarkStart w:id="71" w:name="_Toc244342793"/>
       <w:r>
         <w:rPr>
           <w:rFonts w:eastAsia="Times New Roman" w:cs="Times New Roman"/>
@@ -33257,7 +33277,7 @@
                 <w:sz w:val="21"/>
                 <w:szCs w:val="21"/>
               </w:rPr>
-              <w:t>Phân tích đầy đủ I2C 400 kHz, UART 921600, Wi-Fi 802.11 b/g/n, BLE 5.0 và ngăn xếp bảo mật TLS / TlsGate; đường truyền cảnh báo độ trễ thấp 5 lớp (UDP, BLE, Pre-Warm TLS, Fast-Flush, đua đa kênh)</w:t>
+              <w:t>Phân tích đầy đủ I2C 400 kHz, UART 921600, Wi-Fi 802.11 b/g/n, BLE 5.0 và ngăn xếp bảo mật TLS / TlsGate; đường truyền cảnh báo độ trễ thấp 5 lớp (UDP, BLE, thiết lập kết nối trước (connection pre-warming), Fast-Flush, đua đa kênh)</w:t>
             </w:r>
           </w:p>
         </w:tc>
@@ -33976,7 +33996,7 @@
         <w:spacing w:before="120" w:after="240"/>
         <w:jc w:val="center"/>
       </w:pPr>
-      <w:bookmarkStart w:id="72" w:name="_Toc244339802"/>
+      <w:bookmarkStart w:id="72" w:name="_Toc244342794"/>
       <w:r>
         <w:rPr>
           <w:rFonts w:eastAsia="Times New Roman" w:cs="Times New Roman"/>
@@ -33993,7 +34013,7 @@
         <w:spacing w:before="200" w:after="120"/>
         <w:jc w:val="left"/>
       </w:pPr>
-      <w:bookmarkStart w:id="73" w:name="_Toc244339803"/>
+      <w:bookmarkStart w:id="73" w:name="_Toc244342795"/>
       <w:r>
         <w:rPr>
           <w:rFonts w:eastAsia="Times New Roman" w:cs="Times New Roman"/>
@@ -34063,7 +34083,7 @@
           <w:rFonts w:eastAsia="Times New Roman"/>
           <w:szCs w:val="26"/>
         </w:rPr>
-        <w:t>Thực hiện các động tác đi bộ, ngồi xuống ghế, cúi người nhặt đồ và vỗ nhẹ vào thiết bị. Chỉ ra trên giao diện Web rằng dù gia tốc tức thời có lúc vượt 2,0g nhưng do không thỏa mãn điều kiện nằm yên ≥ 80% và góc lệch ≥ 45° sau pha lắng nên hệ thống hoàn toàn không báo giả.</w:t>
+        <w:t>Thực hiện các động tác đi bộ, ngồi xuống ghế, cúi người nhặt đồ và vỗ nhẹ vào thiết bị. Chỉ ra trên giao diện Web rằng dù gia tốc tức thời có lúc vượt 2,0g nhưng do không thỏa mãn điều kiện nằm yên ≥ 80% và góc lệch ≥ 45° sau pha ổn định (settling) nên hệ thống hoàn toàn không báo giả.</w:t>
       </w:r>
     </w:p>
     <w:p>
@@ -34084,7 +34104,7 @@
           <w:rFonts w:eastAsia="Times New Roman"/>
           <w:szCs w:val="26"/>
         </w:rPr>
-        <w:t xml:space="preserve">Thực hiện động tác ngã mô phỏng xuống đệm an toàn và nằm yên trong 3 giây (1 giây lắng + 2 giây quan sát). Ngay khi kết thúc giây thứ 3: (1) Còi BZ1 và LED đỏ D3 trên mạch lập tức bật báo động tại chỗ; (2) Giao diện Web cục bộ và Firebase Cloud chuyển sang dải màu ĐỎ khẩn cấp; (3) Điện thoại nhận được tin nhắn Telegram và email Gmail kèm thông số đỉnh va chạm (ví dụ 2,95g) và góc lệch tư thế (78°); đồng thời nhánh Camera K230 hiển thị khung bao đỏ FALL ALARM và đính kèm ảnh chụp hiện trường. Trên điện thoại, ứng dụng «Báo Ngã IoT» bật </w:t>
+        <w:t xml:space="preserve">Thực hiện động tác ngã mô phỏng xuống đệm an toàn và nằm yên trong 3 giây (1 giây ổn định + 2 giây xác minh). Ngay khi kết thúc giây thứ 3: (1) Còi BZ1 và LED đỏ D3 trên mạch lập tức bật báo động tại chỗ; (2) Giao diện Web cục bộ và Firebase Cloud chuyển sang dải màu ĐỎ khẩn cấp; (3) Điện thoại nhận được tin nhắn Telegram và email Gmail kèm thông số đỉnh va chạm (ví dụ 2,95g) và góc lệch tư thế (78°); đồng thời nhánh Camera K230 hiển thị khung bao đỏ FALL ALARM và đính kèm ảnh chụp hiện trường. Trên điện thoại, ứng dụng «Báo </w:t>
       </w:r>
       <w:r>
         <w:rPr>
@@ -34092,7 +34112,7 @@
           <w:szCs w:val="26"/>
         </w:rPr>
         <w:lastRenderedPageBreak/>
-        <w:t>màn hình báo động đỏ kèm chuông và rung ngay khi tín hiệu đầu tiên tới; thẻ Nhật ký sự kiện cho thấy kênh tới đầu tiên và thời điểm tới của từng kênh (UDP, BLE, Cloud, LAN). Nếu nhánh Camera cũng phát hiện ngã trong vòng 30 giây, sự cố được gộp và gắn nhãn «ĐA NGUỒN XÁC NHẬN (Vòng đeo + Camera AI)». Sau đó nhấn «ĐÃ KIỂM TRA - TẮT CHUÔNG» trên ứng dụng và chạm 1 lần vào TTP223 để tắt báo động tại chỗ.</w:t>
+        <w:t>Ngã IoT» bật màn hình báo động đỏ kèm chuông và rung ngay khi tín hiệu đầu tiên tới; thẻ Nhật ký sự kiện cho thấy kênh tới đầu tiên và thời điểm tới của từng kênh (UDP, BLE, Cloud, LAN). Nếu nhánh Camera cũng phát hiện ngã trong vòng 30 giây, sự cố được gộp và gắn nhãn «ĐA NGUỒN XÁC NHẬN (Vòng đeo + Camera AI)». Sau đó nhấn «ĐÃ KIỂM TRA - TẮT CHUÔNG» trên ứng dụng và chạm 1 lần vào TTP223 để tắt báo động tại chỗ.</w:t>
       </w:r>
     </w:p>
     <w:p>
@@ -34122,7 +34142,7 @@
         <w:spacing w:before="200" w:after="120"/>
         <w:jc w:val="left"/>
       </w:pPr>
-      <w:bookmarkStart w:id="74" w:name="_Toc244339804"/>
+      <w:bookmarkStart w:id="74" w:name="_Toc244342796"/>
       <w:r>
         <w:rPr>
           <w:rFonts w:eastAsia="Times New Roman" w:cs="Times New Roman"/>
@@ -34292,7 +34312,7 @@
         <w:spacing w:before="120" w:after="240"/>
         <w:jc w:val="center"/>
       </w:pPr>
-      <w:bookmarkStart w:id="75" w:name="_Toc244339805"/>
+      <w:bookmarkStart w:id="75" w:name="_Toc244342797"/>
       <w:r>
         <w:rPr>
           <w:rFonts w:eastAsia="Times New Roman" w:cs="Times New Roman"/>
@@ -37796,7 +37816,7 @@
         <w:spacing w:before="120" w:after="240"/>
         <w:jc w:val="center"/>
       </w:pPr>
-      <w:bookmarkStart w:id="76" w:name="_Toc244339806"/>
+      <w:bookmarkStart w:id="76" w:name="_Toc244342798"/>
       <w:r>
         <w:rPr>
           <w:rFonts w:eastAsia="Times New Roman" w:cs="Times New Roman"/>

</xml_diff>